<commit_message>
Test plans: cases for adding stock to, and receiving, an expired product
Co-Authored-By: Claude Opus 5.5 <noreply@anthropic.com>
</commit_message>
<xml_diff>
--- a/QA/FETCH-UAT-Administrator.docx
+++ b/QA/FETCH-UAT-Administrator.docx
@@ -368,7 +368,7 @@
                 <w:sz w:val="16"/>
                 <w:szCs w:val="16"/>
               </w:rPr>
-              <w:t xml:space="preserve">Administrator (54 test cases: 19 happy, 35 sad)</w:t>
+              <w:t xml:space="preserve">Administrator (56 test cases: 19 happy, 37 sad)</w:t>
             </w:r>
           </w:p>
         </w:tc>
@@ -7040,7 +7040,7 @@
                 <w:sz w:val="16"/>
                 <w:szCs w:val="16"/>
               </w:rPr>
-              <w:t xml:space="preserve">4.3</w:t>
+              <w:t xml:space="preserve">4.2c</w:t>
             </w:r>
           </w:p>
         </w:tc>
@@ -7064,6 +7064,107 @@
           <w:p>
             <w:pPr>
               <w:spacing w:after="0" w:line="230"/>
+              <w:jc w:val="left"/>
+            </w:pPr>
+            <w:r>
+              <w:rPr>
+                <w:rFonts w:ascii="Arial" w:cs="Arial" w:eastAsia="Arial" w:hAnsi="Arial"/>
+                <w:b w:val="false"/>
+                <w:bCs w:val="false"/>
+                <w:color w:val="000000"/>
+                <w:sz w:val="16"/>
+                <w:szCs w:val="16"/>
+              </w:rPr>
+              <w:t xml:space="preserve">Sad case</w:t>
+            </w:r>
+          </w:p>
+        </w:tc>
+        <w:tc>
+          <w:tcPr>
+            <w:tcW w:type="dxa" w:w="720"/>
+            <w:tcBorders>
+              <w:top w:val="single" w:color="808080" w:sz="4"/>
+              <w:left w:val="single" w:color="808080" w:sz="4"/>
+              <w:bottom w:val="single" w:color="808080" w:sz="4"/>
+              <w:right w:val="single" w:color="808080" w:sz="4"/>
+            </w:tcBorders>
+            <w:tcMar>
+              <w:top w:type="dxa" w:w="45"/>
+              <w:left w:type="dxa" w:w="80"/>
+              <w:bottom w:type="dxa" w:w="45"/>
+              <w:right w:type="dxa" w:w="80"/>
+            </w:tcMar>
+            <w:vAlign w:val="center"/>
+          </w:tcPr>
+          <w:p>
+            <w:pPr>
+              <w:spacing w:after="0" w:line="230"/>
+              <w:jc w:val="center"/>
+            </w:pPr>
+            <w:r>
+              <w:rPr>
+                <w:rFonts w:ascii="Arial" w:cs="Arial" w:eastAsia="Arial" w:hAnsi="Arial"/>
+                <w:color w:val="000000"/>
+                <w:sz w:val="16"/>
+                <w:szCs w:val="16"/>
+              </w:rPr>
+              <w:t xml:space="preserve">AD-18</w:t>
+            </w:r>
+          </w:p>
+        </w:tc>
+        <w:tc>
+          <w:tcPr>
+            <w:tcW w:type="dxa" w:w="3820"/>
+            <w:tcBorders>
+              <w:top w:val="single" w:color="808080" w:sz="4"/>
+              <w:left w:val="single" w:color="808080" w:sz="4"/>
+              <w:bottom w:val="single" w:color="808080" w:sz="4"/>
+              <w:right w:val="single" w:color="808080" w:sz="4"/>
+            </w:tcBorders>
+            <w:tcMar>
+              <w:top w:type="dxa" w:w="45"/>
+              <w:left w:type="dxa" w:w="80"/>
+              <w:bottom w:type="dxa" w:w="45"/>
+              <w:right w:type="dxa" w:w="80"/>
+            </w:tcMar>
+            <w:vAlign w:val="center"/>
+          </w:tcPr>
+          <w:p>
+            <w:pPr>
+              <w:spacing w:after="0" w:line="230"/>
+              <w:jc w:val="left"/>
+            </w:pPr>
+            <w:r>
+              <w:rPr>
+                <w:rFonts w:ascii="Arial" w:cs="Arial" w:eastAsia="Arial" w:hAnsi="Arial"/>
+                <w:color w:val="000000"/>
+                <w:sz w:val="16"/>
+                <w:szCs w:val="16"/>
+              </w:rPr>
+              <w:t xml:space="preserve">Click Stock on a product that has expired, choose "Add stock (received, found, returned)", leave the expiration date empty, then click Save adjustment</w:t>
+            </w:r>
+          </w:p>
+        </w:tc>
+        <w:tc>
+          <w:tcPr>
+            <w:tcW w:type="dxa" w:w="3820"/>
+            <w:tcBorders>
+              <w:top w:val="single" w:color="808080" w:sz="4"/>
+              <w:left w:val="single" w:color="808080" w:sz="4"/>
+              <w:bottom w:val="single" w:color="808080" w:sz="4"/>
+              <w:right w:val="single" w:color="808080" w:sz="4"/>
+            </w:tcBorders>
+            <w:tcMar>
+              <w:top w:type="dxa" w:w="45"/>
+              <w:left w:type="dxa" w:w="80"/>
+              <w:bottom w:type="dxa" w:w="45"/>
+              <w:right w:type="dxa" w:w="80"/>
+            </w:tcMar>
+            <w:vAlign w:val="center"/>
+          </w:tcPr>
+          <w:p>
+            <w:pPr>
+              <w:spacing w:after="60" w:line="230"/>
               <w:jc w:val="left"/>
             </w:pPr>
             <w:r>
@@ -7071,110 +7172,42 @@
                 <w:rFonts w:ascii="Arial" w:cs="Arial" w:eastAsia="Arial" w:hAnsi="Arial"/>
                 <w:b/>
                 <w:bCs/>
-                <w:color w:val="000000"/>
-                <w:sz w:val="16"/>
-                <w:szCs w:val="16"/>
-              </w:rPr>
-              <w:t xml:space="preserve">Happy case</w:t>
-            </w:r>
-          </w:p>
-        </w:tc>
-        <w:tc>
-          <w:tcPr>
-            <w:tcW w:type="dxa" w:w="720"/>
-            <w:tcBorders>
-              <w:top w:val="single" w:color="808080" w:sz="4"/>
-              <w:left w:val="single" w:color="808080" w:sz="4"/>
-              <w:bottom w:val="single" w:color="808080" w:sz="4"/>
-              <w:right w:val="single" w:color="808080" w:sz="4"/>
-            </w:tcBorders>
-            <w:tcMar>
-              <w:top w:type="dxa" w:w="45"/>
-              <w:left w:type="dxa" w:w="80"/>
-              <w:bottom w:type="dxa" w:w="45"/>
-              <w:right w:type="dxa" w:w="80"/>
-            </w:tcMar>
-            <w:vAlign w:val="center"/>
-          </w:tcPr>
-          <w:p>
-            <w:pPr>
-              <w:spacing w:after="0" w:line="230"/>
-              <w:jc w:val="center"/>
-            </w:pPr>
-            <w:r>
-              <w:rPr>
-                <w:rFonts w:ascii="Arial" w:cs="Arial" w:eastAsia="Arial" w:hAnsi="Arial"/>
-                <w:color w:val="000000"/>
-                <w:sz w:val="16"/>
-                <w:szCs w:val="16"/>
-              </w:rPr>
-              <w:t xml:space="preserve">AD-18</w:t>
-            </w:r>
-          </w:p>
-        </w:tc>
-        <w:tc>
-          <w:tcPr>
-            <w:tcW w:type="dxa" w:w="3820"/>
-            <w:tcBorders>
-              <w:top w:val="single" w:color="808080" w:sz="4"/>
-              <w:left w:val="single" w:color="808080" w:sz="4"/>
-              <w:bottom w:val="single" w:color="808080" w:sz="4"/>
-              <w:right w:val="single" w:color="808080" w:sz="4"/>
-            </w:tcBorders>
-            <w:tcMar>
-              <w:top w:type="dxa" w:w="45"/>
-              <w:left w:type="dxa" w:w="80"/>
-              <w:bottom w:type="dxa" w:w="45"/>
-              <w:right w:type="dxa" w:w="80"/>
-            </w:tcMar>
-            <w:vAlign w:val="center"/>
-          </w:tcPr>
-          <w:p>
-            <w:pPr>
-              <w:spacing w:after="0" w:line="230"/>
-              <w:jc w:val="left"/>
-            </w:pPr>
-            <w:r>
-              <w:rPr>
-                <w:rFonts w:ascii="Arial" w:cs="Arial" w:eastAsia="Arial" w:hAnsi="Arial"/>
-                <w:color w:val="000000"/>
-                <w:sz w:val="16"/>
-                <w:szCs w:val="16"/>
-              </w:rPr>
-              <w:t xml:space="preserve">Open a product, click Delete, then click Yes, Delete</w:t>
-            </w:r>
-          </w:p>
-        </w:tc>
-        <w:tc>
-          <w:tcPr>
-            <w:tcW w:type="dxa" w:w="3820"/>
-            <w:tcBorders>
-              <w:top w:val="single" w:color="808080" w:sz="4"/>
-              <w:left w:val="single" w:color="808080" w:sz="4"/>
-              <w:bottom w:val="single" w:color="808080" w:sz="4"/>
-              <w:right w:val="single" w:color="808080" w:sz="4"/>
-            </w:tcBorders>
-            <w:tcMar>
-              <w:top w:type="dxa" w:w="45"/>
-              <w:left w:type="dxa" w:w="80"/>
-              <w:bottom w:type="dxa" w:w="45"/>
-              <w:right w:type="dxa" w:w="80"/>
-            </w:tcMar>
-            <w:vAlign w:val="center"/>
-          </w:tcPr>
-          <w:p>
-            <w:pPr>
-              <w:spacing w:after="0" w:line="230"/>
-              <w:jc w:val="left"/>
-            </w:pPr>
-            <w:r>
-              <w:rPr>
-                <w:rFonts w:ascii="Arial" w:cs="Arial" w:eastAsia="Arial" w:hAnsi="Arial"/>
-                <w:color w:val="000000"/>
-                <w:sz w:val="16"/>
-                <w:szCs w:val="16"/>
-              </w:rPr>
-              <w:t xml:space="preserve">A message "Product deleted" is displayed and the product leaves the list</w:t>
+                <w:sz w:val="16"/>
+                <w:szCs w:val="16"/>
+              </w:rPr>
+              <w:t xml:space="preserve">Problem: </w:t>
+            </w:r>
+            <w:r>
+              <w:rPr>
+                <w:rFonts w:ascii="Arial" w:cs="Arial" w:eastAsia="Arial" w:hAnsi="Arial"/>
+                <w:sz w:val="16"/>
+                <w:szCs w:val="16"/>
+              </w:rPr>
+              <w:t xml:space="preserve">A message "(product) expired on (date). Enter the expiration date of the stock being added, or the new stock would be counted as expired too." is displayed and the stock does not change</w:t>
+            </w:r>
+          </w:p>
+          <w:p>
+            <w:pPr>
+              <w:spacing w:after="0" w:line="230"/>
+              <w:jc w:val="left"/>
+            </w:pPr>
+            <w:r>
+              <w:rPr>
+                <w:rFonts w:ascii="Arial" w:cs="Arial" w:eastAsia="Arial" w:hAnsi="Arial"/>
+                <w:b/>
+                <w:bCs/>
+                <w:sz w:val="16"/>
+                <w:szCs w:val="16"/>
+              </w:rPr>
+              <w:t xml:space="preserve">Solution: </w:t>
+            </w:r>
+            <w:r>
+              <w:rPr>
+                <w:rFonts w:ascii="Arial" w:cs="Arial" w:eastAsia="Arial" w:hAnsi="Arial"/>
+                <w:sz w:val="16"/>
+                <w:szCs w:val="16"/>
+              </w:rPr>
+              <w:t xml:space="preserve">Enter the expiration date printed on the new stock</w:t>
             </w:r>
           </w:p>
         </w:tc>
@@ -7345,7 +7378,7 @@
                 <w:sz w:val="16"/>
                 <w:szCs w:val="16"/>
               </w:rPr>
-              <w:t xml:space="preserve">4.3a</w:t>
+              <w:t xml:space="preserve">4.3</w:t>
             </w:r>
           </w:p>
         </w:tc>
@@ -7369,107 +7402,6 @@
           <w:p>
             <w:pPr>
               <w:spacing w:after="0" w:line="230"/>
-              <w:jc w:val="left"/>
-            </w:pPr>
-            <w:r>
-              <w:rPr>
-                <w:rFonts w:ascii="Arial" w:cs="Arial" w:eastAsia="Arial" w:hAnsi="Arial"/>
-                <w:b w:val="false"/>
-                <w:bCs w:val="false"/>
-                <w:color w:val="000000"/>
-                <w:sz w:val="16"/>
-                <w:szCs w:val="16"/>
-              </w:rPr>
-              <w:t xml:space="preserve">Sad case</w:t>
-            </w:r>
-          </w:p>
-        </w:tc>
-        <w:tc>
-          <w:tcPr>
-            <w:tcW w:type="dxa" w:w="720"/>
-            <w:tcBorders>
-              <w:top w:val="single" w:color="808080" w:sz="4"/>
-              <w:left w:val="single" w:color="808080" w:sz="4"/>
-              <w:bottom w:val="single" w:color="808080" w:sz="4"/>
-              <w:right w:val="single" w:color="808080" w:sz="4"/>
-            </w:tcBorders>
-            <w:tcMar>
-              <w:top w:type="dxa" w:w="45"/>
-              <w:left w:type="dxa" w:w="80"/>
-              <w:bottom w:type="dxa" w:w="45"/>
-              <w:right w:type="dxa" w:w="80"/>
-            </w:tcMar>
-            <w:vAlign w:val="center"/>
-          </w:tcPr>
-          <w:p>
-            <w:pPr>
-              <w:spacing w:after="0" w:line="230"/>
-              <w:jc w:val="center"/>
-            </w:pPr>
-            <w:r>
-              <w:rPr>
-                <w:rFonts w:ascii="Arial" w:cs="Arial" w:eastAsia="Arial" w:hAnsi="Arial"/>
-                <w:color w:val="000000"/>
-                <w:sz w:val="16"/>
-                <w:szCs w:val="16"/>
-              </w:rPr>
-              <w:t xml:space="preserve">AD-19</w:t>
-            </w:r>
-          </w:p>
-        </w:tc>
-        <w:tc>
-          <w:tcPr>
-            <w:tcW w:type="dxa" w:w="3820"/>
-            <w:tcBorders>
-              <w:top w:val="single" w:color="808080" w:sz="4"/>
-              <w:left w:val="single" w:color="808080" w:sz="4"/>
-              <w:bottom w:val="single" w:color="808080" w:sz="4"/>
-              <w:right w:val="single" w:color="808080" w:sz="4"/>
-            </w:tcBorders>
-            <w:tcMar>
-              <w:top w:type="dxa" w:w="45"/>
-              <w:left w:type="dxa" w:w="80"/>
-              <w:bottom w:type="dxa" w:w="45"/>
-              <w:right w:type="dxa" w:w="80"/>
-            </w:tcMar>
-            <w:vAlign w:val="center"/>
-          </w:tcPr>
-          <w:p>
-            <w:pPr>
-              <w:spacing w:after="0" w:line="230"/>
-              <w:jc w:val="left"/>
-            </w:pPr>
-            <w:r>
-              <w:rPr>
-                <w:rFonts w:ascii="Arial" w:cs="Arial" w:eastAsia="Arial" w:hAnsi="Arial"/>
-                <w:color w:val="000000"/>
-                <w:sz w:val="16"/>
-                <w:szCs w:val="16"/>
-              </w:rPr>
-              <w:t xml:space="preserve">Open a product, click Delete, then click Cancel</w:t>
-            </w:r>
-          </w:p>
-        </w:tc>
-        <w:tc>
-          <w:tcPr>
-            <w:tcW w:type="dxa" w:w="3820"/>
-            <w:tcBorders>
-              <w:top w:val="single" w:color="808080" w:sz="4"/>
-              <w:left w:val="single" w:color="808080" w:sz="4"/>
-              <w:bottom w:val="single" w:color="808080" w:sz="4"/>
-              <w:right w:val="single" w:color="808080" w:sz="4"/>
-            </w:tcBorders>
-            <w:tcMar>
-              <w:top w:type="dxa" w:w="45"/>
-              <w:left w:type="dxa" w:w="80"/>
-              <w:bottom w:type="dxa" w:w="45"/>
-              <w:right w:type="dxa" w:w="80"/>
-            </w:tcMar>
-            <w:vAlign w:val="center"/>
-          </w:tcPr>
-          <w:p>
-            <w:pPr>
-              <w:spacing w:after="60" w:line="230"/>
               <w:jc w:val="left"/>
             </w:pPr>
             <w:r>
@@ -7477,42 +7409,110 @@
                 <w:rFonts w:ascii="Arial" w:cs="Arial" w:eastAsia="Arial" w:hAnsi="Arial"/>
                 <w:b/>
                 <w:bCs/>
-                <w:sz w:val="16"/>
-                <w:szCs w:val="16"/>
-              </w:rPr>
-              <w:t xml:space="preserve">Problem: </w:t>
-            </w:r>
-            <w:r>
-              <w:rPr>
-                <w:rFonts w:ascii="Arial" w:cs="Arial" w:eastAsia="Arial" w:hAnsi="Arial"/>
-                <w:sz w:val="16"/>
-                <w:szCs w:val="16"/>
-              </w:rPr>
-              <w:t xml:space="preserve">The question closes and the product is still in Inventory</w:t>
-            </w:r>
-          </w:p>
-          <w:p>
-            <w:pPr>
-              <w:spacing w:after="0" w:line="230"/>
-              <w:jc w:val="left"/>
-            </w:pPr>
-            <w:r>
-              <w:rPr>
-                <w:rFonts w:ascii="Arial" w:cs="Arial" w:eastAsia="Arial" w:hAnsi="Arial"/>
-                <w:b/>
-                <w:bCs/>
-                <w:sz w:val="16"/>
-                <w:szCs w:val="16"/>
-              </w:rPr>
-              <w:t xml:space="preserve">Solution: </w:t>
-            </w:r>
-            <w:r>
-              <w:rPr>
-                <w:rFonts w:ascii="Arial" w:cs="Arial" w:eastAsia="Arial" w:hAnsi="Arial"/>
-                <w:sz w:val="16"/>
-                <w:szCs w:val="16"/>
-              </w:rPr>
-              <w:t xml:space="preserve">No action</w:t>
+                <w:color w:val="000000"/>
+                <w:sz w:val="16"/>
+                <w:szCs w:val="16"/>
+              </w:rPr>
+              <w:t xml:space="preserve">Happy case</w:t>
+            </w:r>
+          </w:p>
+        </w:tc>
+        <w:tc>
+          <w:tcPr>
+            <w:tcW w:type="dxa" w:w="720"/>
+            <w:tcBorders>
+              <w:top w:val="single" w:color="808080" w:sz="4"/>
+              <w:left w:val="single" w:color="808080" w:sz="4"/>
+              <w:bottom w:val="single" w:color="808080" w:sz="4"/>
+              <w:right w:val="single" w:color="808080" w:sz="4"/>
+            </w:tcBorders>
+            <w:tcMar>
+              <w:top w:type="dxa" w:w="45"/>
+              <w:left w:type="dxa" w:w="80"/>
+              <w:bottom w:type="dxa" w:w="45"/>
+              <w:right w:type="dxa" w:w="80"/>
+            </w:tcMar>
+            <w:vAlign w:val="center"/>
+          </w:tcPr>
+          <w:p>
+            <w:pPr>
+              <w:spacing w:after="0" w:line="230"/>
+              <w:jc w:val="center"/>
+            </w:pPr>
+            <w:r>
+              <w:rPr>
+                <w:rFonts w:ascii="Arial" w:cs="Arial" w:eastAsia="Arial" w:hAnsi="Arial"/>
+                <w:color w:val="000000"/>
+                <w:sz w:val="16"/>
+                <w:szCs w:val="16"/>
+              </w:rPr>
+              <w:t xml:space="preserve">AD-19</w:t>
+            </w:r>
+          </w:p>
+        </w:tc>
+        <w:tc>
+          <w:tcPr>
+            <w:tcW w:type="dxa" w:w="3820"/>
+            <w:tcBorders>
+              <w:top w:val="single" w:color="808080" w:sz="4"/>
+              <w:left w:val="single" w:color="808080" w:sz="4"/>
+              <w:bottom w:val="single" w:color="808080" w:sz="4"/>
+              <w:right w:val="single" w:color="808080" w:sz="4"/>
+            </w:tcBorders>
+            <w:tcMar>
+              <w:top w:type="dxa" w:w="45"/>
+              <w:left w:type="dxa" w:w="80"/>
+              <w:bottom w:type="dxa" w:w="45"/>
+              <w:right w:type="dxa" w:w="80"/>
+            </w:tcMar>
+            <w:vAlign w:val="center"/>
+          </w:tcPr>
+          <w:p>
+            <w:pPr>
+              <w:spacing w:after="0" w:line="230"/>
+              <w:jc w:val="left"/>
+            </w:pPr>
+            <w:r>
+              <w:rPr>
+                <w:rFonts w:ascii="Arial" w:cs="Arial" w:eastAsia="Arial" w:hAnsi="Arial"/>
+                <w:color w:val="000000"/>
+                <w:sz w:val="16"/>
+                <w:szCs w:val="16"/>
+              </w:rPr>
+              <w:t xml:space="preserve">Open a product, click Delete, then click Yes, Delete</w:t>
+            </w:r>
+          </w:p>
+        </w:tc>
+        <w:tc>
+          <w:tcPr>
+            <w:tcW w:type="dxa" w:w="3820"/>
+            <w:tcBorders>
+              <w:top w:val="single" w:color="808080" w:sz="4"/>
+              <w:left w:val="single" w:color="808080" w:sz="4"/>
+              <w:bottom w:val="single" w:color="808080" w:sz="4"/>
+              <w:right w:val="single" w:color="808080" w:sz="4"/>
+            </w:tcBorders>
+            <w:tcMar>
+              <w:top w:type="dxa" w:w="45"/>
+              <w:left w:type="dxa" w:w="80"/>
+              <w:bottom w:type="dxa" w:w="45"/>
+              <w:right w:type="dxa" w:w="80"/>
+            </w:tcMar>
+            <w:vAlign w:val="center"/>
+          </w:tcPr>
+          <w:p>
+            <w:pPr>
+              <w:spacing w:after="0" w:line="230"/>
+              <w:jc w:val="left"/>
+            </w:pPr>
+            <w:r>
+              <w:rPr>
+                <w:rFonts w:ascii="Arial" w:cs="Arial" w:eastAsia="Arial" w:hAnsi="Arial"/>
+                <w:color w:val="000000"/>
+                <w:sz w:val="16"/>
+                <w:szCs w:val="16"/>
+              </w:rPr>
+              <w:t xml:space="preserve">A message "Product deleted" is displayed and the product leaves the list</w:t>
             </w:r>
           </w:p>
         </w:tc>
@@ -7622,6 +7622,344 @@
         </w:trPr>
         <w:tc>
           <w:tcPr>
+            <w:tcW w:type="dxa" w:w="1000"/>
+            <w:tcBorders>
+              <w:top w:val="single" w:color="808080" w:sz="4"/>
+              <w:left w:val="single" w:color="808080" w:sz="4"/>
+              <w:bottom w:val="single" w:color="808080" w:sz="4"/>
+              <w:right w:val="single" w:color="808080" w:sz="4"/>
+            </w:tcBorders>
+            <w:shd w:fill="1E4D2B" w:val="clear"/>
+            <w:tcMar>
+              <w:top w:type="dxa" w:w="45"/>
+              <w:left w:type="dxa" w:w="80"/>
+              <w:bottom w:type="dxa" w:w="45"/>
+              <w:right w:type="dxa" w:w="80"/>
+            </w:tcMar>
+            <w:vAlign w:val="center"/>
+          </w:tcPr>
+          <w:p>
+            <w:pPr>
+              <w:spacing w:after="0" w:line="230"/>
+              <w:jc w:val="left"/>
+            </w:pPr>
+            <w:r>
+              <w:rPr>
+                <w:rFonts w:ascii="Arial" w:cs="Arial" w:eastAsia="Arial" w:hAnsi="Arial"/>
+                <w:color w:val="000000"/>
+                <w:sz w:val="16"/>
+                <w:szCs w:val="16"/>
+              </w:rPr>
+              <w:t xml:space="preserve"/>
+            </w:r>
+          </w:p>
+        </w:tc>
+        <w:tc>
+          <w:tcPr>
+            <w:tcW w:type="dxa" w:w="520"/>
+            <w:tcBorders>
+              <w:top w:val="single" w:color="808080" w:sz="4"/>
+              <w:left w:val="single" w:color="808080" w:sz="4"/>
+              <w:bottom w:val="single" w:color="808080" w:sz="4"/>
+              <w:right w:val="single" w:color="808080" w:sz="4"/>
+            </w:tcBorders>
+            <w:tcMar>
+              <w:top w:type="dxa" w:w="45"/>
+              <w:left w:type="dxa" w:w="80"/>
+              <w:bottom w:type="dxa" w:w="45"/>
+              <w:right w:type="dxa" w:w="80"/>
+            </w:tcMar>
+            <w:vAlign w:val="center"/>
+          </w:tcPr>
+          <w:p>
+            <w:pPr>
+              <w:spacing w:after="0" w:line="230"/>
+              <w:jc w:val="center"/>
+            </w:pPr>
+            <w:r>
+              <w:rPr>
+                <w:rFonts w:ascii="Arial" w:cs="Arial" w:eastAsia="Arial" w:hAnsi="Arial"/>
+                <w:color w:val="000000"/>
+                <w:sz w:val="16"/>
+                <w:szCs w:val="16"/>
+              </w:rPr>
+              <w:t xml:space="preserve">4.3a</w:t>
+            </w:r>
+          </w:p>
+        </w:tc>
+        <w:tc>
+          <w:tcPr>
+            <w:tcW w:type="dxa" w:w="1100"/>
+            <w:tcBorders>
+              <w:top w:val="single" w:color="808080" w:sz="4"/>
+              <w:left w:val="single" w:color="808080" w:sz="4"/>
+              <w:bottom w:val="single" w:color="808080" w:sz="4"/>
+              <w:right w:val="single" w:color="808080" w:sz="4"/>
+            </w:tcBorders>
+            <w:tcMar>
+              <w:top w:type="dxa" w:w="45"/>
+              <w:left w:type="dxa" w:w="80"/>
+              <w:bottom w:type="dxa" w:w="45"/>
+              <w:right w:type="dxa" w:w="80"/>
+            </w:tcMar>
+            <w:vAlign w:val="center"/>
+          </w:tcPr>
+          <w:p>
+            <w:pPr>
+              <w:spacing w:after="0" w:line="230"/>
+              <w:jc w:val="left"/>
+            </w:pPr>
+            <w:r>
+              <w:rPr>
+                <w:rFonts w:ascii="Arial" w:cs="Arial" w:eastAsia="Arial" w:hAnsi="Arial"/>
+                <w:b w:val="false"/>
+                <w:bCs w:val="false"/>
+                <w:color w:val="000000"/>
+                <w:sz w:val="16"/>
+                <w:szCs w:val="16"/>
+              </w:rPr>
+              <w:t xml:space="preserve">Sad case</w:t>
+            </w:r>
+          </w:p>
+        </w:tc>
+        <w:tc>
+          <w:tcPr>
+            <w:tcW w:type="dxa" w:w="720"/>
+            <w:tcBorders>
+              <w:top w:val="single" w:color="808080" w:sz="4"/>
+              <w:left w:val="single" w:color="808080" w:sz="4"/>
+              <w:bottom w:val="single" w:color="808080" w:sz="4"/>
+              <w:right w:val="single" w:color="808080" w:sz="4"/>
+            </w:tcBorders>
+            <w:tcMar>
+              <w:top w:type="dxa" w:w="45"/>
+              <w:left w:type="dxa" w:w="80"/>
+              <w:bottom w:type="dxa" w:w="45"/>
+              <w:right w:type="dxa" w:w="80"/>
+            </w:tcMar>
+            <w:vAlign w:val="center"/>
+          </w:tcPr>
+          <w:p>
+            <w:pPr>
+              <w:spacing w:after="0" w:line="230"/>
+              <w:jc w:val="center"/>
+            </w:pPr>
+            <w:r>
+              <w:rPr>
+                <w:rFonts w:ascii="Arial" w:cs="Arial" w:eastAsia="Arial" w:hAnsi="Arial"/>
+                <w:color w:val="000000"/>
+                <w:sz w:val="16"/>
+                <w:szCs w:val="16"/>
+              </w:rPr>
+              <w:t xml:space="preserve">AD-20</w:t>
+            </w:r>
+          </w:p>
+        </w:tc>
+        <w:tc>
+          <w:tcPr>
+            <w:tcW w:type="dxa" w:w="3820"/>
+            <w:tcBorders>
+              <w:top w:val="single" w:color="808080" w:sz="4"/>
+              <w:left w:val="single" w:color="808080" w:sz="4"/>
+              <w:bottom w:val="single" w:color="808080" w:sz="4"/>
+              <w:right w:val="single" w:color="808080" w:sz="4"/>
+            </w:tcBorders>
+            <w:tcMar>
+              <w:top w:type="dxa" w:w="45"/>
+              <w:left w:type="dxa" w:w="80"/>
+              <w:bottom w:type="dxa" w:w="45"/>
+              <w:right w:type="dxa" w:w="80"/>
+            </w:tcMar>
+            <w:vAlign w:val="center"/>
+          </w:tcPr>
+          <w:p>
+            <w:pPr>
+              <w:spacing w:after="0" w:line="230"/>
+              <w:jc w:val="left"/>
+            </w:pPr>
+            <w:r>
+              <w:rPr>
+                <w:rFonts w:ascii="Arial" w:cs="Arial" w:eastAsia="Arial" w:hAnsi="Arial"/>
+                <w:color w:val="000000"/>
+                <w:sz w:val="16"/>
+                <w:szCs w:val="16"/>
+              </w:rPr>
+              <w:t xml:space="preserve">Open a product, click Delete, then click Cancel</w:t>
+            </w:r>
+          </w:p>
+        </w:tc>
+        <w:tc>
+          <w:tcPr>
+            <w:tcW w:type="dxa" w:w="3820"/>
+            <w:tcBorders>
+              <w:top w:val="single" w:color="808080" w:sz="4"/>
+              <w:left w:val="single" w:color="808080" w:sz="4"/>
+              <w:bottom w:val="single" w:color="808080" w:sz="4"/>
+              <w:right w:val="single" w:color="808080" w:sz="4"/>
+            </w:tcBorders>
+            <w:tcMar>
+              <w:top w:type="dxa" w:w="45"/>
+              <w:left w:type="dxa" w:w="80"/>
+              <w:bottom w:type="dxa" w:w="45"/>
+              <w:right w:type="dxa" w:w="80"/>
+            </w:tcMar>
+            <w:vAlign w:val="center"/>
+          </w:tcPr>
+          <w:p>
+            <w:pPr>
+              <w:spacing w:after="60" w:line="230"/>
+              <w:jc w:val="left"/>
+            </w:pPr>
+            <w:r>
+              <w:rPr>
+                <w:rFonts w:ascii="Arial" w:cs="Arial" w:eastAsia="Arial" w:hAnsi="Arial"/>
+                <w:b/>
+                <w:bCs/>
+                <w:sz w:val="16"/>
+                <w:szCs w:val="16"/>
+              </w:rPr>
+              <w:t xml:space="preserve">Problem: </w:t>
+            </w:r>
+            <w:r>
+              <w:rPr>
+                <w:rFonts w:ascii="Arial" w:cs="Arial" w:eastAsia="Arial" w:hAnsi="Arial"/>
+                <w:sz w:val="16"/>
+                <w:szCs w:val="16"/>
+              </w:rPr>
+              <w:t xml:space="preserve">The question closes and the product is still in Inventory</w:t>
+            </w:r>
+          </w:p>
+          <w:p>
+            <w:pPr>
+              <w:spacing w:after="0" w:line="230"/>
+              <w:jc w:val="left"/>
+            </w:pPr>
+            <w:r>
+              <w:rPr>
+                <w:rFonts w:ascii="Arial" w:cs="Arial" w:eastAsia="Arial" w:hAnsi="Arial"/>
+                <w:b/>
+                <w:bCs/>
+                <w:sz w:val="16"/>
+                <w:szCs w:val="16"/>
+              </w:rPr>
+              <w:t xml:space="preserve">Solution: </w:t>
+            </w:r>
+            <w:r>
+              <w:rPr>
+                <w:rFonts w:ascii="Arial" w:cs="Arial" w:eastAsia="Arial" w:hAnsi="Arial"/>
+                <w:sz w:val="16"/>
+                <w:szCs w:val="16"/>
+              </w:rPr>
+              <w:t xml:space="preserve">No action</w:t>
+            </w:r>
+          </w:p>
+        </w:tc>
+        <w:tc>
+          <w:tcPr>
+            <w:tcW w:type="dxa" w:w="1300"/>
+            <w:tcBorders>
+              <w:top w:val="single" w:color="808080" w:sz="4"/>
+              <w:left w:val="single" w:color="808080" w:sz="4"/>
+              <w:bottom w:val="single" w:color="808080" w:sz="4"/>
+              <w:right w:val="single" w:color="808080" w:sz="4"/>
+            </w:tcBorders>
+            <w:tcMar>
+              <w:top w:type="dxa" w:w="45"/>
+              <w:left w:type="dxa" w:w="80"/>
+              <w:bottom w:type="dxa" w:w="45"/>
+              <w:right w:type="dxa" w:w="80"/>
+            </w:tcMar>
+            <w:vAlign w:val="center"/>
+          </w:tcPr>
+          <w:p>
+            <w:pPr>
+              <w:spacing w:after="0" w:line="230"/>
+              <w:jc w:val="left"/>
+            </w:pPr>
+            <w:r>
+              <w:rPr>
+                <w:rFonts w:ascii="Arial" w:cs="Arial" w:eastAsia="Arial" w:hAnsi="Arial"/>
+                <w:color w:val="000000"/>
+                <w:sz w:val="16"/>
+                <w:szCs w:val="16"/>
+              </w:rPr>
+              <w:t xml:space="preserve"/>
+            </w:r>
+          </w:p>
+        </w:tc>
+        <w:tc>
+          <w:tcPr>
+            <w:tcW w:type="dxa" w:w="900"/>
+            <w:tcBorders>
+              <w:top w:val="single" w:color="808080" w:sz="4"/>
+              <w:left w:val="single" w:color="808080" w:sz="4"/>
+              <w:bottom w:val="single" w:color="808080" w:sz="4"/>
+              <w:right w:val="single" w:color="808080" w:sz="4"/>
+            </w:tcBorders>
+            <w:tcMar>
+              <w:top w:type="dxa" w:w="45"/>
+              <w:left w:type="dxa" w:w="80"/>
+              <w:bottom w:type="dxa" w:w="45"/>
+              <w:right w:type="dxa" w:w="80"/>
+            </w:tcMar>
+            <w:vAlign w:val="center"/>
+          </w:tcPr>
+          <w:p>
+            <w:pPr>
+              <w:spacing w:after="0" w:line="230"/>
+              <w:jc w:val="left"/>
+            </w:pPr>
+            <w:r>
+              <w:rPr>
+                <w:rFonts w:ascii="Arial" w:cs="Arial" w:eastAsia="Arial" w:hAnsi="Arial"/>
+                <w:color w:val="000000"/>
+                <w:sz w:val="16"/>
+                <w:szCs w:val="16"/>
+              </w:rPr>
+              <w:t xml:space="preserve"/>
+            </w:r>
+          </w:p>
+        </w:tc>
+        <w:tc>
+          <w:tcPr>
+            <w:tcW w:type="dxa" w:w="1220"/>
+            <w:tcBorders>
+              <w:top w:val="single" w:color="808080" w:sz="4"/>
+              <w:left w:val="single" w:color="808080" w:sz="4"/>
+              <w:bottom w:val="single" w:color="808080" w:sz="4"/>
+              <w:right w:val="single" w:color="808080" w:sz="4"/>
+            </w:tcBorders>
+            <w:tcMar>
+              <w:top w:type="dxa" w:w="45"/>
+              <w:left w:type="dxa" w:w="80"/>
+              <w:bottom w:type="dxa" w:w="45"/>
+              <w:right w:type="dxa" w:w="80"/>
+            </w:tcMar>
+            <w:vAlign w:val="center"/>
+          </w:tcPr>
+          <w:p>
+            <w:pPr>
+              <w:spacing w:after="0" w:line="230"/>
+              <w:jc w:val="left"/>
+            </w:pPr>
+            <w:r>
+              <w:rPr>
+                <w:rFonts w:ascii="Arial" w:cs="Arial" w:eastAsia="Arial" w:hAnsi="Arial"/>
+                <w:color w:val="000000"/>
+                <w:sz w:val="16"/>
+                <w:szCs w:val="16"/>
+              </w:rPr>
+              <w:t xml:space="preserve"/>
+            </w:r>
+          </w:p>
+        </w:tc>
+      </w:tr>
+      <w:tr>
+        <w:trPr>
+          <w:cantSplit/>
+        </w:trPr>
+        <w:tc>
+          <w:tcPr>
             <w:tcW w:type="dxa" w:w="14400"/>
             <w:gridSpan w:val="9"/>
             <w:tcBorders>
@@ -7793,7 +8131,7 @@
                 <w:sz w:val="16"/>
                 <w:szCs w:val="16"/>
               </w:rPr>
-              <w:t xml:space="preserve">AD-20</w:t>
+              <w:t xml:space="preserve">AD-21</w:t>
             </w:r>
           </w:p>
         </w:tc>
@@ -8098,7 +8436,7 @@
                 <w:sz w:val="16"/>
                 <w:szCs w:val="16"/>
               </w:rPr>
-              <w:t xml:space="preserve">AD-21</w:t>
+              <w:t xml:space="preserve">AD-22</w:t>
             </w:r>
           </w:p>
         </w:tc>
@@ -8478,7 +8816,7 @@
                 <w:sz w:val="16"/>
                 <w:szCs w:val="16"/>
               </w:rPr>
-              <w:t xml:space="preserve">AD-22</w:t>
+              <w:t xml:space="preserve">AD-23</w:t>
             </w:r>
           </w:p>
         </w:tc>
@@ -8783,7 +9121,7 @@
                 <w:sz w:val="16"/>
                 <w:szCs w:val="16"/>
               </w:rPr>
-              <w:t xml:space="preserve">AD-23</w:t>
+              <w:t xml:space="preserve">AD-24</w:t>
             </w:r>
           </w:p>
         </w:tc>
@@ -9121,7 +9459,7 @@
                 <w:sz w:val="16"/>
                 <w:szCs w:val="16"/>
               </w:rPr>
-              <w:t xml:space="preserve">AD-24</w:t>
+              <w:t xml:space="preserve">AD-25</w:t>
             </w:r>
           </w:p>
         </w:tc>
@@ -9459,7 +9797,7 @@
                 <w:sz w:val="16"/>
                 <w:szCs w:val="16"/>
               </w:rPr>
-              <w:t xml:space="preserve">AD-25</w:t>
+              <w:t xml:space="preserve">AD-26</w:t>
             </w:r>
           </w:p>
         </w:tc>
@@ -9764,7 +10102,7 @@
                 <w:sz w:val="16"/>
                 <w:szCs w:val="16"/>
               </w:rPr>
-              <w:t xml:space="preserve">AD-26</w:t>
+              <w:t xml:space="preserve">AD-27</w:t>
             </w:r>
           </w:p>
         </w:tc>
@@ -10102,7 +10440,7 @@
                 <w:sz w:val="16"/>
                 <w:szCs w:val="16"/>
               </w:rPr>
-              <w:t xml:space="preserve">AD-27</w:t>
+              <w:t xml:space="preserve">AD-28</w:t>
             </w:r>
           </w:p>
         </w:tc>
@@ -10407,7 +10745,7 @@
                 <w:sz w:val="16"/>
                 <w:szCs w:val="16"/>
               </w:rPr>
-              <w:t xml:space="preserve">AD-28</w:t>
+              <w:t xml:space="preserve">AD-29</w:t>
             </w:r>
           </w:p>
         </w:tc>
@@ -10745,7 +11083,7 @@
                 <w:sz w:val="16"/>
                 <w:szCs w:val="16"/>
               </w:rPr>
-              <w:t xml:space="preserve">AD-29</w:t>
+              <w:t xml:space="preserve">AD-30</w:t>
             </w:r>
           </w:p>
         </w:tc>
@@ -11125,7 +11463,7 @@
                 <w:sz w:val="16"/>
                 <w:szCs w:val="16"/>
               </w:rPr>
-              <w:t xml:space="preserve">AD-30</w:t>
+              <w:t xml:space="preserve">AD-31</w:t>
             </w:r>
           </w:p>
         </w:tc>
@@ -11430,7 +11768,7 @@
                 <w:sz w:val="16"/>
                 <w:szCs w:val="16"/>
               </w:rPr>
-              <w:t xml:space="preserve">AD-31</w:t>
+              <w:t xml:space="preserve">AD-32</w:t>
             </w:r>
           </w:p>
         </w:tc>
@@ -11768,7 +12106,7 @@
                 <w:sz w:val="16"/>
                 <w:szCs w:val="16"/>
               </w:rPr>
-              <w:t xml:space="preserve">AD-32</w:t>
+              <w:t xml:space="preserve">AD-33</w:t>
             </w:r>
           </w:p>
         </w:tc>
@@ -12106,7 +12444,7 @@
                 <w:sz w:val="16"/>
                 <w:szCs w:val="16"/>
               </w:rPr>
-              <w:t xml:space="preserve">AD-33</w:t>
+              <w:t xml:space="preserve">AD-34</w:t>
             </w:r>
           </w:p>
         </w:tc>
@@ -12444,7 +12782,7 @@
                 <w:sz w:val="16"/>
                 <w:szCs w:val="16"/>
               </w:rPr>
-              <w:t xml:space="preserve">AD-34</w:t>
+              <w:t xml:space="preserve">AD-35</w:t>
             </w:r>
           </w:p>
         </w:tc>
@@ -12749,7 +13087,7 @@
                 <w:sz w:val="16"/>
                 <w:szCs w:val="16"/>
               </w:rPr>
-              <w:t xml:space="preserve">AD-35</w:t>
+              <w:t xml:space="preserve">AD-36</w:t>
             </w:r>
           </w:p>
         </w:tc>
@@ -13087,7 +13425,7 @@
                 <w:sz w:val="16"/>
                 <w:szCs w:val="16"/>
               </w:rPr>
-              <w:t xml:space="preserve">AD-36</w:t>
+              <w:t xml:space="preserve">AD-37</w:t>
             </w:r>
           </w:p>
         </w:tc>
@@ -13467,7 +13805,7 @@
                 <w:sz w:val="16"/>
                 <w:szCs w:val="16"/>
               </w:rPr>
-              <w:t xml:space="preserve">AD-37</w:t>
+              <w:t xml:space="preserve">AD-38</w:t>
             </w:r>
           </w:p>
         </w:tc>
@@ -13772,7 +14110,7 @@
                 <w:sz w:val="16"/>
                 <w:szCs w:val="16"/>
               </w:rPr>
-              <w:t xml:space="preserve">AD-38</w:t>
+              <w:t xml:space="preserve">AD-39</w:t>
             </w:r>
           </w:p>
         </w:tc>
@@ -13981,6 +14319,344 @@
         </w:trPr>
         <w:tc>
           <w:tcPr>
+            <w:tcW w:type="dxa" w:w="1000"/>
+            <w:tcBorders>
+              <w:top w:val="single" w:color="808080" w:sz="4"/>
+              <w:left w:val="single" w:color="808080" w:sz="4"/>
+              <w:bottom w:val="single" w:color="808080" w:sz="4"/>
+              <w:right w:val="single" w:color="808080" w:sz="4"/>
+            </w:tcBorders>
+            <w:shd w:fill="1E4D2B" w:val="clear"/>
+            <w:tcMar>
+              <w:top w:type="dxa" w:w="45"/>
+              <w:left w:type="dxa" w:w="80"/>
+              <w:bottom w:type="dxa" w:w="45"/>
+              <w:right w:type="dxa" w:w="80"/>
+            </w:tcMar>
+            <w:vAlign w:val="center"/>
+          </w:tcPr>
+          <w:p>
+            <w:pPr>
+              <w:spacing w:after="0" w:line="230"/>
+              <w:jc w:val="left"/>
+            </w:pPr>
+            <w:r>
+              <w:rPr>
+                <w:rFonts w:ascii="Arial" w:cs="Arial" w:eastAsia="Arial" w:hAnsi="Arial"/>
+                <w:color w:val="000000"/>
+                <w:sz w:val="16"/>
+                <w:szCs w:val="16"/>
+              </w:rPr>
+              <w:t xml:space="preserve"/>
+            </w:r>
+          </w:p>
+        </w:tc>
+        <w:tc>
+          <w:tcPr>
+            <w:tcW w:type="dxa" w:w="520"/>
+            <w:tcBorders>
+              <w:top w:val="single" w:color="808080" w:sz="4"/>
+              <w:left w:val="single" w:color="808080" w:sz="4"/>
+              <w:bottom w:val="single" w:color="808080" w:sz="4"/>
+              <w:right w:val="single" w:color="808080" w:sz="4"/>
+            </w:tcBorders>
+            <w:tcMar>
+              <w:top w:type="dxa" w:w="45"/>
+              <w:left w:type="dxa" w:w="80"/>
+              <w:bottom w:type="dxa" w:w="45"/>
+              <w:right w:type="dxa" w:w="80"/>
+            </w:tcMar>
+            <w:vAlign w:val="center"/>
+          </w:tcPr>
+          <w:p>
+            <w:pPr>
+              <w:spacing w:after="0" w:line="230"/>
+              <w:jc w:val="center"/>
+            </w:pPr>
+            <w:r>
+              <w:rPr>
+                <w:rFonts w:ascii="Arial" w:cs="Arial" w:eastAsia="Arial" w:hAnsi="Arial"/>
+                <w:color w:val="000000"/>
+                <w:sz w:val="16"/>
+                <w:szCs w:val="16"/>
+              </w:rPr>
+              <w:t xml:space="preserve">8.1b</w:t>
+            </w:r>
+          </w:p>
+        </w:tc>
+        <w:tc>
+          <w:tcPr>
+            <w:tcW w:type="dxa" w:w="1100"/>
+            <w:tcBorders>
+              <w:top w:val="single" w:color="808080" w:sz="4"/>
+              <w:left w:val="single" w:color="808080" w:sz="4"/>
+              <w:bottom w:val="single" w:color="808080" w:sz="4"/>
+              <w:right w:val="single" w:color="808080" w:sz="4"/>
+            </w:tcBorders>
+            <w:tcMar>
+              <w:top w:type="dxa" w:w="45"/>
+              <w:left w:type="dxa" w:w="80"/>
+              <w:bottom w:type="dxa" w:w="45"/>
+              <w:right w:type="dxa" w:w="80"/>
+            </w:tcMar>
+            <w:vAlign w:val="center"/>
+          </w:tcPr>
+          <w:p>
+            <w:pPr>
+              <w:spacing w:after="0" w:line="230"/>
+              <w:jc w:val="left"/>
+            </w:pPr>
+            <w:r>
+              <w:rPr>
+                <w:rFonts w:ascii="Arial" w:cs="Arial" w:eastAsia="Arial" w:hAnsi="Arial"/>
+                <w:b w:val="false"/>
+                <w:bCs w:val="false"/>
+                <w:color w:val="000000"/>
+                <w:sz w:val="16"/>
+                <w:szCs w:val="16"/>
+              </w:rPr>
+              <w:t xml:space="preserve">Sad case</w:t>
+            </w:r>
+          </w:p>
+        </w:tc>
+        <w:tc>
+          <w:tcPr>
+            <w:tcW w:type="dxa" w:w="720"/>
+            <w:tcBorders>
+              <w:top w:val="single" w:color="808080" w:sz="4"/>
+              <w:left w:val="single" w:color="808080" w:sz="4"/>
+              <w:bottom w:val="single" w:color="808080" w:sz="4"/>
+              <w:right w:val="single" w:color="808080" w:sz="4"/>
+            </w:tcBorders>
+            <w:tcMar>
+              <w:top w:type="dxa" w:w="45"/>
+              <w:left w:type="dxa" w:w="80"/>
+              <w:bottom w:type="dxa" w:w="45"/>
+              <w:right w:type="dxa" w:w="80"/>
+            </w:tcMar>
+            <w:vAlign w:val="center"/>
+          </w:tcPr>
+          <w:p>
+            <w:pPr>
+              <w:spacing w:after="0" w:line="230"/>
+              <w:jc w:val="center"/>
+            </w:pPr>
+            <w:r>
+              <w:rPr>
+                <w:rFonts w:ascii="Arial" w:cs="Arial" w:eastAsia="Arial" w:hAnsi="Arial"/>
+                <w:color w:val="000000"/>
+                <w:sz w:val="16"/>
+                <w:szCs w:val="16"/>
+              </w:rPr>
+              <w:t xml:space="preserve">AD-40</w:t>
+            </w:r>
+          </w:p>
+        </w:tc>
+        <w:tc>
+          <w:tcPr>
+            <w:tcW w:type="dxa" w:w="3820"/>
+            <w:tcBorders>
+              <w:top w:val="single" w:color="808080" w:sz="4"/>
+              <w:left w:val="single" w:color="808080" w:sz="4"/>
+              <w:bottom w:val="single" w:color="808080" w:sz="4"/>
+              <w:right w:val="single" w:color="808080" w:sz="4"/>
+            </w:tcBorders>
+            <w:tcMar>
+              <w:top w:type="dxa" w:w="45"/>
+              <w:left w:type="dxa" w:w="80"/>
+              <w:bottom w:type="dxa" w:w="45"/>
+              <w:right w:type="dxa" w:w="80"/>
+            </w:tcMar>
+            <w:vAlign w:val="center"/>
+          </w:tcPr>
+          <w:p>
+            <w:pPr>
+              <w:spacing w:after="0" w:line="230"/>
+              <w:jc w:val="left"/>
+            </w:pPr>
+            <w:r>
+              <w:rPr>
+                <w:rFonts w:ascii="Arial" w:cs="Arial" w:eastAsia="Arial" w:hAnsi="Arial"/>
+                <w:color w:val="000000"/>
+                <w:sz w:val="16"/>
+                <w:szCs w:val="16"/>
+              </w:rPr>
+              <w:t xml:space="preserve">Click Receive into stock on an order for a product that has already expired, and leave the date empty</w:t>
+            </w:r>
+          </w:p>
+        </w:tc>
+        <w:tc>
+          <w:tcPr>
+            <w:tcW w:type="dxa" w:w="3820"/>
+            <w:tcBorders>
+              <w:top w:val="single" w:color="808080" w:sz="4"/>
+              <w:left w:val="single" w:color="808080" w:sz="4"/>
+              <w:bottom w:val="single" w:color="808080" w:sz="4"/>
+              <w:right w:val="single" w:color="808080" w:sz="4"/>
+            </w:tcBorders>
+            <w:tcMar>
+              <w:top w:type="dxa" w:w="45"/>
+              <w:left w:type="dxa" w:w="80"/>
+              <w:bottom w:type="dxa" w:w="45"/>
+              <w:right w:type="dxa" w:w="80"/>
+            </w:tcMar>
+            <w:vAlign w:val="center"/>
+          </w:tcPr>
+          <w:p>
+            <w:pPr>
+              <w:spacing w:after="60" w:line="230"/>
+              <w:jc w:val="left"/>
+            </w:pPr>
+            <w:r>
+              <w:rPr>
+                <w:rFonts w:ascii="Arial" w:cs="Arial" w:eastAsia="Arial" w:hAnsi="Arial"/>
+                <w:b/>
+                <w:bCs/>
+                <w:sz w:val="16"/>
+                <w:szCs w:val="16"/>
+              </w:rPr>
+              <w:t xml:space="preserve">Problem: </w:t>
+            </w:r>
+            <w:r>
+              <w:rPr>
+                <w:rFonts w:ascii="Arial" w:cs="Arial" w:eastAsia="Arial" w:hAnsi="Arial"/>
+                <w:sz w:val="16"/>
+                <w:szCs w:val="16"/>
+              </w:rPr>
+              <w:t xml:space="preserve">A message "(product) (expired (date)) has already expired, so enter the new batch's expiration date" is shown; clicking Receive into stock with no date shows "Enter the new batch's expiration date: the current one has already passed." and the order is not received</w:t>
+            </w:r>
+          </w:p>
+          <w:p>
+            <w:pPr>
+              <w:spacing w:after="0" w:line="230"/>
+              <w:jc w:val="left"/>
+            </w:pPr>
+            <w:r>
+              <w:rPr>
+                <w:rFonts w:ascii="Arial" w:cs="Arial" w:eastAsia="Arial" w:hAnsi="Arial"/>
+                <w:b/>
+                <w:bCs/>
+                <w:sz w:val="16"/>
+                <w:szCs w:val="16"/>
+              </w:rPr>
+              <w:t xml:space="preserve">Solution: </w:t>
+            </w:r>
+            <w:r>
+              <w:rPr>
+                <w:rFonts w:ascii="Arial" w:cs="Arial" w:eastAsia="Arial" w:hAnsi="Arial"/>
+                <w:sz w:val="16"/>
+                <w:szCs w:val="16"/>
+              </w:rPr>
+              <w:t xml:space="preserve">Enter the expiration date of the new batch</w:t>
+            </w:r>
+          </w:p>
+        </w:tc>
+        <w:tc>
+          <w:tcPr>
+            <w:tcW w:type="dxa" w:w="1300"/>
+            <w:tcBorders>
+              <w:top w:val="single" w:color="808080" w:sz="4"/>
+              <w:left w:val="single" w:color="808080" w:sz="4"/>
+              <w:bottom w:val="single" w:color="808080" w:sz="4"/>
+              <w:right w:val="single" w:color="808080" w:sz="4"/>
+            </w:tcBorders>
+            <w:tcMar>
+              <w:top w:type="dxa" w:w="45"/>
+              <w:left w:type="dxa" w:w="80"/>
+              <w:bottom w:type="dxa" w:w="45"/>
+              <w:right w:type="dxa" w:w="80"/>
+            </w:tcMar>
+            <w:vAlign w:val="center"/>
+          </w:tcPr>
+          <w:p>
+            <w:pPr>
+              <w:spacing w:after="0" w:line="230"/>
+              <w:jc w:val="left"/>
+            </w:pPr>
+            <w:r>
+              <w:rPr>
+                <w:rFonts w:ascii="Arial" w:cs="Arial" w:eastAsia="Arial" w:hAnsi="Arial"/>
+                <w:color w:val="000000"/>
+                <w:sz w:val="16"/>
+                <w:szCs w:val="16"/>
+              </w:rPr>
+              <w:t xml:space="preserve"/>
+            </w:r>
+          </w:p>
+        </w:tc>
+        <w:tc>
+          <w:tcPr>
+            <w:tcW w:type="dxa" w:w="900"/>
+            <w:tcBorders>
+              <w:top w:val="single" w:color="808080" w:sz="4"/>
+              <w:left w:val="single" w:color="808080" w:sz="4"/>
+              <w:bottom w:val="single" w:color="808080" w:sz="4"/>
+              <w:right w:val="single" w:color="808080" w:sz="4"/>
+            </w:tcBorders>
+            <w:tcMar>
+              <w:top w:type="dxa" w:w="45"/>
+              <w:left w:type="dxa" w:w="80"/>
+              <w:bottom w:type="dxa" w:w="45"/>
+              <w:right w:type="dxa" w:w="80"/>
+            </w:tcMar>
+            <w:vAlign w:val="center"/>
+          </w:tcPr>
+          <w:p>
+            <w:pPr>
+              <w:spacing w:after="0" w:line="230"/>
+              <w:jc w:val="left"/>
+            </w:pPr>
+            <w:r>
+              <w:rPr>
+                <w:rFonts w:ascii="Arial" w:cs="Arial" w:eastAsia="Arial" w:hAnsi="Arial"/>
+                <w:color w:val="000000"/>
+                <w:sz w:val="16"/>
+                <w:szCs w:val="16"/>
+              </w:rPr>
+              <w:t xml:space="preserve"/>
+            </w:r>
+          </w:p>
+        </w:tc>
+        <w:tc>
+          <w:tcPr>
+            <w:tcW w:type="dxa" w:w="1220"/>
+            <w:tcBorders>
+              <w:top w:val="single" w:color="808080" w:sz="4"/>
+              <w:left w:val="single" w:color="808080" w:sz="4"/>
+              <w:bottom w:val="single" w:color="808080" w:sz="4"/>
+              <w:right w:val="single" w:color="808080" w:sz="4"/>
+            </w:tcBorders>
+            <w:tcMar>
+              <w:top w:type="dxa" w:w="45"/>
+              <w:left w:type="dxa" w:w="80"/>
+              <w:bottom w:type="dxa" w:w="45"/>
+              <w:right w:type="dxa" w:w="80"/>
+            </w:tcMar>
+            <w:vAlign w:val="center"/>
+          </w:tcPr>
+          <w:p>
+            <w:pPr>
+              <w:spacing w:after="0" w:line="230"/>
+              <w:jc w:val="left"/>
+            </w:pPr>
+            <w:r>
+              <w:rPr>
+                <w:rFonts w:ascii="Arial" w:cs="Arial" w:eastAsia="Arial" w:hAnsi="Arial"/>
+                <w:color w:val="000000"/>
+                <w:sz w:val="16"/>
+                <w:szCs w:val="16"/>
+              </w:rPr>
+              <w:t xml:space="preserve"/>
+            </w:r>
+          </w:p>
+        </w:tc>
+      </w:tr>
+      <w:tr>
+        <w:trPr>
+          <w:cantSplit/>
+        </w:trPr>
+        <w:tc>
+          <w:tcPr>
             <w:tcW w:type="dxa" w:w="14400"/>
             <w:gridSpan w:val="9"/>
             <w:tcBorders>
@@ -14152,7 +14828,7 @@
                 <w:sz w:val="16"/>
                 <w:szCs w:val="16"/>
               </w:rPr>
-              <w:t xml:space="preserve">AD-39</w:t>
+              <w:t xml:space="preserve">AD-41</w:t>
             </w:r>
           </w:p>
         </w:tc>
@@ -14457,7 +15133,7 @@
                 <w:sz w:val="16"/>
                 <w:szCs w:val="16"/>
               </w:rPr>
-              <w:t xml:space="preserve">AD-40</w:t>
+              <w:t xml:space="preserve">AD-42</w:t>
             </w:r>
           </w:p>
         </w:tc>
@@ -14795,7 +15471,7 @@
                 <w:sz w:val="16"/>
                 <w:szCs w:val="16"/>
               </w:rPr>
-              <w:t xml:space="preserve">AD-41</w:t>
+              <w:t xml:space="preserve">AD-43</w:t>
             </w:r>
           </w:p>
         </w:tc>
@@ -15133,7 +15809,7 @@
                 <w:sz w:val="16"/>
                 <w:szCs w:val="16"/>
               </w:rPr>
-              <w:t xml:space="preserve">AD-42</w:t>
+              <w:t xml:space="preserve">AD-44</w:t>
             </w:r>
           </w:p>
         </w:tc>
@@ -15438,7 +16114,7 @@
                 <w:sz w:val="16"/>
                 <w:szCs w:val="16"/>
               </w:rPr>
-              <w:t xml:space="preserve">AD-43</w:t>
+              <w:t xml:space="preserve">AD-45</w:t>
             </w:r>
           </w:p>
         </w:tc>
@@ -15818,7 +16494,7 @@
                 <w:sz w:val="16"/>
                 <w:szCs w:val="16"/>
               </w:rPr>
-              <w:t xml:space="preserve">AD-44</w:t>
+              <w:t xml:space="preserve">AD-46</w:t>
             </w:r>
           </w:p>
         </w:tc>
@@ -16123,7 +16799,7 @@
                 <w:sz w:val="16"/>
                 <w:szCs w:val="16"/>
               </w:rPr>
-              <w:t xml:space="preserve">AD-45</w:t>
+              <w:t xml:space="preserve">AD-47</w:t>
             </w:r>
           </w:p>
         </w:tc>
@@ -16461,7 +17137,7 @@
                 <w:sz w:val="16"/>
                 <w:szCs w:val="16"/>
               </w:rPr>
-              <w:t xml:space="preserve">AD-46</w:t>
+              <w:t xml:space="preserve">AD-48</w:t>
             </w:r>
           </w:p>
         </w:tc>
@@ -16799,7 +17475,7 @@
                 <w:sz w:val="16"/>
                 <w:szCs w:val="16"/>
               </w:rPr>
-              <w:t xml:space="preserve">AD-47</w:t>
+              <w:t xml:space="preserve">AD-49</w:t>
             </w:r>
           </w:p>
         </w:tc>
@@ -17137,7 +17813,7 @@
                 <w:sz w:val="16"/>
                 <w:szCs w:val="16"/>
               </w:rPr>
-              <w:t xml:space="preserve">AD-48</w:t>
+              <w:t xml:space="preserve">AD-50</w:t>
             </w:r>
           </w:p>
         </w:tc>
@@ -17442,7 +18118,7 @@
                 <w:sz w:val="16"/>
                 <w:szCs w:val="16"/>
               </w:rPr>
-              <w:t xml:space="preserve">AD-49</w:t>
+              <w:t xml:space="preserve">AD-51</w:t>
             </w:r>
           </w:p>
         </w:tc>
@@ -17822,7 +18498,7 @@
                 <w:sz w:val="16"/>
                 <w:szCs w:val="16"/>
               </w:rPr>
-              <w:t xml:space="preserve">AD-50</w:t>
+              <w:t xml:space="preserve">AD-52</w:t>
             </w:r>
           </w:p>
         </w:tc>
@@ -18127,7 +18803,7 @@
                 <w:sz w:val="16"/>
                 <w:szCs w:val="16"/>
               </w:rPr>
-              <w:t xml:space="preserve">AD-51</w:t>
+              <w:t xml:space="preserve">AD-53</w:t>
             </w:r>
           </w:p>
         </w:tc>
@@ -18465,7 +19141,7 @@
                 <w:sz w:val="16"/>
                 <w:szCs w:val="16"/>
               </w:rPr>
-              <w:t xml:space="preserve">AD-52</w:t>
+              <w:t xml:space="preserve">AD-54</w:t>
             </w:r>
           </w:p>
         </w:tc>
@@ -18803,7 +19479,7 @@
                 <w:sz w:val="16"/>
                 <w:szCs w:val="16"/>
               </w:rPr>
-              <w:t xml:space="preserve">AD-53</w:t>
+              <w:t xml:space="preserve">AD-55</w:t>
             </w:r>
           </w:p>
         </w:tc>
@@ -19141,7 +19817,7 @@
                 <w:sz w:val="16"/>
                 <w:szCs w:val="16"/>
               </w:rPr>
-              <w:t xml:space="preserve">AD-54</w:t>
+              <w:t xml:space="preserve">AD-56</w:t>
             </w:r>
           </w:p>
         </w:tc>

</xml_diff>

<commit_message>
UAT in technical wording: tables, columns, requests and exact results
Co-Authored-By: Claude Opus 5.5 <noreply@anthropic.com>
</commit_message>
<xml_diff>
--- a/QA/FETCH-UAT-Administrator.docx
+++ b/QA/FETCH-UAT-Administrator.docx
@@ -697,7 +697,7 @@
                 <w:rFonts w:ascii="Calibri" w:hAnsi="Calibri"/>
                 <w:sz w:val="21"/>
               </w:rPr>
-              <w:t>Check if Username is empty: leave Username empty, then click Sign in</w:t>
+              <w:t>Check if Username is empty: leave Username empty and click Sign in. The required field is checked in the browser before POST /api/auth/login is sent</w:t>
             </w:r>
           </w:p>
         </w:tc>
@@ -715,7 +715,7 @@
                 <w:rFonts w:ascii="Calibri" w:hAnsi="Calibri"/>
                 <w:sz w:val="21"/>
               </w:rPr>
-              <w:t>A tooltip "Please fill out this field." is displayed on Username</w:t>
+              <w:t>The request is not sent and the tooltip "Please fill out this field." is displayed on Username</w:t>
             </w:r>
           </w:p>
         </w:tc>
@@ -855,7 +855,7 @@
                 <w:rFonts w:ascii="Calibri" w:hAnsi="Calibri"/>
                 <w:sz w:val="21"/>
               </w:rPr>
-              <w:t>Check if the password has no number: enter a new password without a number</w:t>
+              <w:t>Check if the password has no number: on the reset page, enter a new password without a number (0–9). The password policy needs 6 or more characters with an uppercase letter, a lowercase letter, a number and a special character</w:t>
             </w:r>
           </w:p>
         </w:tc>
@@ -873,7 +873,7 @@
                 <w:rFonts w:ascii="Calibri" w:hAnsi="Calibri"/>
                 <w:sz w:val="21"/>
               </w:rPr>
-              <w:t>A message "Password must contain at least one number (0–9)" is displayed</w:t>
+              <w:t>"Password must contain at least one number (0–9)" is displayed and users.password is not updated</w:t>
             </w:r>
           </w:p>
         </w:tc>
@@ -1013,7 +1013,7 @@
                 <w:rFonts w:ascii="Calibri" w:hAnsi="Calibri"/>
                 <w:sz w:val="21"/>
               </w:rPr>
-              <w:t>Check if a 6th wrong sign-in is blocked: enter a wrong password 5 times within 15 minutes, then try a 6th time</w:t>
+              <w:t>Check if a 6th wrong sign-in is blocked: enter a wrong password 5 times within 15 minutes from the same computer, then try a 6th time. The sign-in limiter counts failed attempts per IP address</w:t>
             </w:r>
           </w:p>
         </w:tc>
@@ -1031,7 +1031,7 @@
                 <w:rFonts w:ascii="Calibri" w:hAnsi="Calibri"/>
                 <w:sz w:val="21"/>
               </w:rPr>
-              <w:t>A message "Too many login attempts. Try again in (seconds)s." is displayed and sign-in is refused</w:t>
+              <w:t>POST /api/auth/login returns HTTP 429 with "Too many login attempts. Try again in (seconds)s." and no session token is issued</w:t>
             </w:r>
           </w:p>
         </w:tc>
@@ -1171,7 +1171,7 @@
                 <w:rFonts w:ascii="Calibri" w:hAnsi="Calibri"/>
                 <w:sz w:val="21"/>
               </w:rPr>
-              <w:t>Check if the two passwords do not match: open a reset link, enter a new password and a different password in Confirm password, then click Save new password</w:t>
+              <w:t>Check if the two passwords do not match: open a reset link (reset-password.html?token=…), enter one password in New password and a different one in Confirm password, then click Save new password</w:t>
             </w:r>
           </w:p>
         </w:tc>
@@ -1189,7 +1189,7 @@
                 <w:rFonts w:ascii="Calibri" w:hAnsi="Calibri"/>
                 <w:sz w:val="21"/>
               </w:rPr>
-              <w:t>A message "Passwords do not match." is displayed and the password is not changed</w:t>
+              <w:t>"Passwords do not match." is displayed and users.password is not changed</w:t>
             </w:r>
           </w:p>
         </w:tc>
@@ -1329,7 +1329,7 @@
                 <w:rFonts w:ascii="Calibri" w:hAnsi="Calibri"/>
                 <w:sz w:val="21"/>
               </w:rPr>
-              <w:t>Check if the password is wrong: enter a username with a wrong password, then click Sign in</w:t>
+              <w:t>Check if the password is wrong: sign in with an existing username and a wrong password. The password is compared with the bcrypt hash in users.password</w:t>
             </w:r>
           </w:p>
         </w:tc>
@@ -1347,7 +1347,7 @@
                 <w:rFonts w:ascii="Calibri" w:hAnsi="Calibri"/>
                 <w:sz w:val="21"/>
               </w:rPr>
-              <w:t>A message "Invalid username or password" is displayed</w:t>
+              <w:t>POST /api/auth/login returns HTTP 401 "Invalid username or password" (the same answer as an unknown username), no token cookie is set and the failure is counted toward the lockout</w:t>
             </w:r>
           </w:p>
         </w:tc>
@@ -1487,7 +1487,7 @@
                 <w:rFonts w:ascii="Calibri" w:hAnsi="Calibri"/>
                 <w:sz w:val="21"/>
               </w:rPr>
-              <w:t>Check if the Administrator opens the Dashboard: sign in as Administrator</w:t>
+              <w:t>Check if the Administrator opens the Dashboard: sign in as Administrator. The server issues a signed token (JWT) holding the user id, role 'admin' and token_version</w:t>
             </w:r>
           </w:p>
         </w:tc>
@@ -1505,7 +1505,7 @@
                 <w:rFonts w:ascii="Calibri" w:hAnsi="Calibri"/>
                 <w:sz w:val="21"/>
               </w:rPr>
-              <w:t>The Dashboard opens: the administrator's home page, with the shop's figures</w:t>
+              <w:t>HTTP 200, the token cookie is set and dashboard.html opens with the shop's figures from GET /api/dashboard/stats</w:t>
             </w:r>
           </w:p>
         </w:tc>
@@ -1562,7 +1562,7 @@
                 <w:rFonts w:ascii="Calibri" w:hAnsi="Calibri"/>
                 <w:sz w:val="21"/>
               </w:rPr>
-              <w:t>Check if "Keep me signed in" keeps the session: tick "Keep me signed in", sign in, close the browser and open FETCH again</w:t>
+              <w:t>Check if "Keep me signed in" keeps the session: tick "Keep me signed in", sign in, close the browser and open FETCH again. The token is issued for 7 days instead of 24 hours</w:t>
             </w:r>
           </w:p>
         </w:tc>
@@ -1580,7 +1580,7 @@
                 <w:rFonts w:ascii="Calibri" w:hAnsi="Calibri"/>
                 <w:sz w:val="21"/>
               </w:rPr>
-              <w:t>The user is still signed in</w:t>
+              <w:t>The token is still valid, so the user is signed in without entering the password again</w:t>
             </w:r>
           </w:p>
         </w:tc>
@@ -1804,7 +1804,7 @@
                 <w:rFonts w:ascii="Calibri" w:hAnsi="Calibri"/>
                 <w:sz w:val="21"/>
               </w:rPr>
-              <w:t>Check if each menu opens its own records: sign in as Administrator and click Dashboard, Inventory, Sales, Suppliers, Reports and Users in the sidebar one after another, then click the bell and View all notifications</w:t>
+              <w:t>Check if each menu opens its own records: sign in as Administrator and click Dashboard, Inventory, Sales, Suppliers, Reports and Users in the sidebar one after another, then the bell and View all notifications. Each page loads its records from its own API endpoint</w:t>
             </w:r>
           </w:p>
         </w:tc>
@@ -1822,7 +1822,7 @@
                 <w:rFonts w:ascii="Calibri" w:hAnsi="Calibri"/>
                 <w:sz w:val="21"/>
               </w:rPr>
-              <w:t>Each menu opens its own page with its own records: Inventory lists products, Sales lists sales, Suppliers lists suppliers and Users lists accounts; View all notifications under the bell opens Notifications with the notices</w:t>
+              <w:t>Each request returns HTTP 200 and each page lists its own records: products, sales, suppliers, user accounts and notifications</w:t>
             </w:r>
           </w:p>
         </w:tc>
@@ -1879,7 +1879,7 @@
                 <w:rFonts w:ascii="Calibri" w:hAnsi="Calibri"/>
                 <w:sz w:val="21"/>
               </w:rPr>
-              <w:t>Check if a cashier can open Inventory: sign in as Cashier, then type the address of the Inventory page (inventory.html)</w:t>
+              <w:t>Check if a cashier can open Inventory: sign in as Cashier and type the address of the Inventory page (inventory.html). The server reads the role in the token and checks the pages that role may open</w:t>
             </w:r>
           </w:p>
         </w:tc>
@@ -1897,7 +1897,7 @@
                 <w:rFonts w:ascii="Calibri" w:hAnsi="Calibri"/>
                 <w:sz w:val="21"/>
               </w:rPr>
-              <w:t>The page does not open: the cashier is returned to the Point of Sale</w:t>
+              <w:t>The server redirects the cashier to pos.html, and Inventory API calls from a cashier account are refused with HTTP 403</w:t>
             </w:r>
           </w:p>
         </w:tc>
@@ -1954,7 +1954,7 @@
                 <w:rFonts w:ascii="Calibri" w:hAnsi="Calibri"/>
                 <w:sz w:val="21"/>
               </w:rPr>
-              <w:t>Check if a supplier can open the Dashboard: sign in as Supplier, then type the address of the Dashboard (dashboard.html)</w:t>
+              <w:t>Check if a supplier can open the Dashboard: sign in as Supplier and type the address of the Dashboard (dashboard.html). The server reads the role in the token and checks the pages that role may open</w:t>
             </w:r>
           </w:p>
         </w:tc>
@@ -1972,7 +1972,7 @@
                 <w:rFonts w:ascii="Calibri" w:hAnsi="Calibri"/>
                 <w:sz w:val="21"/>
               </w:rPr>
-              <w:t>The page does not open: the supplier is returned to the Supplier Portal</w:t>
+              <w:t>The server redirects the supplier to supplier.html (Supplier Portal), and shop API calls from a supplier account are refused with HTTP 403</w:t>
             </w:r>
           </w:p>
         </w:tc>
@@ -2112,7 +2112,7 @@
                 <w:rFonts w:ascii="Calibri" w:hAnsi="Calibri"/>
                 <w:sz w:val="21"/>
               </w:rPr>
-              <w:t>Check if Jump to finds a product: press Ctrl + J (Cmd + J on a Mac), type the name of a product, then press Enter</w:t>
+              <w:t>Check if Jump to finds a product: press Ctrl + J (Cmd + J on a Mac), type the name of a product, then press Enter. Jump to searches with GET /api/products?search=(name)&amp;limit=5</w:t>
             </w:r>
           </w:p>
         </w:tc>
@@ -2130,7 +2130,7 @@
                 <w:rFonts w:ascii="Calibri" w:hAnsi="Calibri"/>
                 <w:sz w:val="21"/>
               </w:rPr>
-              <w:t>The Jump to window lists that product and opens it</w:t>
+              <w:t>The product is listed among the matches (5 at most) and Enter opens that product</w:t>
             </w:r>
           </w:p>
         </w:tc>
@@ -2354,7 +2354,7 @@
                 <w:rFonts w:ascii="Calibri" w:hAnsi="Calibri"/>
                 <w:sz w:val="21"/>
               </w:rPr>
-              <w:t>Check if the product counts match Inventory: compare Total Products, Restock Needed and Expiring Soon with the matching cards in Inventory</w:t>
+              <w:t>Check if the product counts match Inventory: compare Total Products, Restock Needed and Expiring Soon on the Dashboard with the matching cards in Inventory. Both pages count the products table with the same query</w:t>
             </w:r>
           </w:p>
         </w:tc>
@@ -2372,7 +2372,7 @@
                 <w:rFonts w:ascii="Calibri" w:hAnsi="Calibri"/>
                 <w:sz w:val="21"/>
               </w:rPr>
-              <w:t>The numbers are the same on both pages (both count the same product records)</w:t>
+              <w:t>The three numbers are equal on both pages; Restock Needed counts the products with stock_quantity at or below reorder_level</w:t>
             </w:r>
           </w:p>
         </w:tc>
@@ -2512,7 +2512,7 @@
                 <w:rFonts w:ascii="Calibri" w:hAnsi="Calibri"/>
                 <w:sz w:val="21"/>
               </w:rPr>
-              <w:t>Check if a voided sale is left out of revenue: void a sale, then look at Recent Sales and Total Revenue</w:t>
+              <w:t>Check if a voided sale is left out of revenue: void a sale, then reload the Dashboard. Total Revenue sums sales.final_amount only where payment_status is not 'voided'</w:t>
             </w:r>
           </w:p>
         </w:tc>
@@ -2530,7 +2530,7 @@
                 <w:rFonts w:ascii="Calibri" w:hAnsi="Calibri"/>
                 <w:sz w:val="21"/>
               </w:rPr>
-              <w:t>The sale is marked "Voided" and is not counted in Total Revenue</w:t>
+              <w:t>The sale reads "Voided" in Recent Sales and Total Revenue goes down by its final_amount</w:t>
             </w:r>
           </w:p>
         </w:tc>
@@ -2754,7 +2754,7 @@
                 <w:rFonts w:ascii="Calibri" w:hAnsi="Calibri"/>
                 <w:sz w:val="21"/>
               </w:rPr>
-              <w:t>Check if Product name is empty: click Add, leave Product name empty, then click Save product</w:t>
+              <w:t>Check if Product name is empty: click Add, leave Product name empty, then click Save product. The form is checked before POST /api/products is sent</w:t>
             </w:r>
           </w:p>
         </w:tc>
@@ -2772,7 +2772,7 @@
                 <w:rFonts w:ascii="Calibri" w:hAnsi="Calibri"/>
                 <w:sz w:val="21"/>
               </w:rPr>
-              <w:t>A message "Enter the product name." is displayed under Product name</w:t>
+              <w:t>"Enter the product name." is displayed under Product name and no row is inserted in products</w:t>
             </w:r>
           </w:p>
         </w:tc>
@@ -2912,7 +2912,7 @@
                 <w:rFonts w:ascii="Calibri" w:hAnsi="Calibri"/>
                 <w:sz w:val="21"/>
               </w:rPr>
-              <w:t>Check if letters can be typed in Unit price: click Add and type letters in Unit price</w:t>
+              <w:t>Check if letters can be typed in Unit price: click Add and type letters in Unit price (a number field saved to products.unit_price)</w:t>
             </w:r>
           </w:p>
         </w:tc>
@@ -2930,7 +2930,7 @@
                 <w:rFonts w:ascii="Calibri" w:hAnsi="Calibri"/>
                 <w:sz w:val="21"/>
               </w:rPr>
-              <w:t>The letters are not typed: Unit price takes numbers only</w:t>
+              <w:t>The letters are not accepted: the field holds numbers only</w:t>
             </w:r>
           </w:p>
         </w:tc>
@@ -3070,7 +3070,7 @@
                 <w:rFonts w:ascii="Calibri" w:hAnsi="Calibri"/>
                 <w:sz w:val="21"/>
               </w:rPr>
-              <w:t>Check if more stock is removed than is on hand: click Stock on a product with 20 in stock, choose "Remove stock (taken out)", enter 999, then click Save adjustment</w:t>
+              <w:t>Check if more stock is removed than is on hand: click Stock on a product with 20 in stock, choose "Remove stock (taken out)", enter 999, then click Save adjustment. PUT /api/products/(id)/stock locks the product row and compares 999 with stock_quantity</w:t>
             </w:r>
           </w:p>
         </w:tc>
@@ -3088,7 +3088,7 @@
                 <w:rFonts w:ascii="Calibri" w:hAnsi="Calibri"/>
                 <w:sz w:val="21"/>
               </w:rPr>
-              <w:t>A message "Only 20 in stock: you cannot remove 999." is displayed and the stock stays 20</w:t>
+              <w:t>HTTP 400 with "Only 20 in stock: you cannot remove 999." The change is rolled back: stock_quantity stays 20 and no stock_movements row is added</w:t>
             </w:r>
           </w:p>
         </w:tc>
@@ -3228,7 +3228,7 @@
                 <w:rFonts w:ascii="Calibri" w:hAnsi="Calibri"/>
                 <w:sz w:val="21"/>
               </w:rPr>
-              <w:t>Check if Low Stock lists only low products: click the Low Stock chip</w:t>
+              <w:t>Check if Low Stock lists only low products: click the Low Stock chip. The list is filtered to products with stock_quantity above 0 and at or below reorder_level</w:t>
             </w:r>
           </w:p>
         </w:tc>
@@ -3246,7 +3246,7 @@
                 <w:rFonts w:ascii="Calibri" w:hAnsi="Calibri"/>
                 <w:sz w:val="21"/>
               </w:rPr>
-              <w:t>Only products at or below their reorder level are listed, and the count on the chip equals the number listed</w:t>
+              <w:t>Only those products are listed, and the count on the chip equals the number of rows</w:t>
             </w:r>
           </w:p>
         </w:tc>
@@ -3386,7 +3386,7 @@
                 <w:rFonts w:ascii="Calibri" w:hAnsi="Calibri"/>
                 <w:sz w:val="21"/>
               </w:rPr>
-              <w:t>Check if the barcode is already used: click Barcodes, tick Show all, type a barcode that another product already uses, then press Enter</w:t>
+              <w:t>Check if the barcode is already used: click Barcodes, tick Show all, type a barcode that another product already has, then press Enter. PUT /api/products/(id) looks for another product with the same products.barcode</w:t>
             </w:r>
           </w:p>
         </w:tc>
@@ -3404,7 +3404,7 @@
                 <w:rFonts w:ascii="Calibri" w:hAnsi="Calibri"/>
                 <w:sz w:val="21"/>
               </w:rPr>
-              <w:t>A message "The barcode (code) is already used by (product) (SKU (sku)). Each product needs its own barcode." is displayed</w:t>
+              <w:t>HTTP 409 with "The barcode (code) is already used by (product) (SKU (sku)). Each product needs its own barcode." and products.barcode is not changed</w:t>
             </w:r>
           </w:p>
         </w:tc>
@@ -3544,7 +3544,7 @@
                 <w:rFonts w:ascii="Calibri" w:hAnsi="Calibri"/>
                 <w:sz w:val="21"/>
               </w:rPr>
-              <w:t>Check if reordering creates purchase orders: click Reorder, tick the products, click Reorder Selected, then click Yes, Create Orders</w:t>
+              <w:t>Check if reordering creates purchase orders: click Reorder, tick the products, click Reorder Selected, then click Yes, Create Orders. POST /api/purchase-orders/auto-generate groups the products by supplier</w:t>
             </w:r>
           </w:p>
         </w:tc>
@@ -3562,7 +3562,7 @@
                 <w:rFonts w:ascii="Calibri" w:hAnsi="Calibri"/>
                 <w:sz w:val="21"/>
               </w:rPr>
-              <w:t>A message "Purchase orders sent" is displayed and each supplier is emailed its order</w:t>
+              <w:t>One purchase_orders row (status 'pending') with its po_items rows is created per supplier, each supplier is emailed its order (logged in email_logs as 'po'), and "Purchase orders sent" is displayed</w:t>
             </w:r>
           </w:p>
         </w:tc>
@@ -3619,7 +3619,7 @@
                 <w:rFonts w:ascii="Calibri" w:hAnsi="Calibri"/>
                 <w:sz w:val="21"/>
               </w:rPr>
-              <w:t>Check if expired stock is written off: click Stock on a product that has expired, choose "Add stock (received, found, returned)", enter the quantity and the new expiration date, then click Save adjustment</w:t>
+              <w:t>Check if expired stock is written off: click Stock on an expired product, choose "Add stock (received, found, returned)", enter the quantity and the new expiration date, then click Save adjustment</w:t>
             </w:r>
           </w:p>
         </w:tc>
@@ -3637,7 +3637,7 @@
                 <w:rFonts w:ascii="Calibri" w:hAnsi="Calibri"/>
                 <w:sz w:val="21"/>
               </w:rPr>
-              <w:t>A message "Recorded +(qty). The (n) expired were removed. Stock is now (qty)." is displayed: the expired stock is written off, the new stock replaces it, and the new expiration date is set so the product can be sold again</w:t>
+              <w:t>A stock_movements row 'damage' takes off the expired units, the new quantity is added, products.expiration_date is set to the new date, and "Recorded +(qty). The (n) expired were removed. Stock is now (qty)." is displayed</w:t>
             </w:r>
           </w:p>
         </w:tc>
@@ -3861,7 +3861,7 @@
                 <w:rFonts w:ascii="Calibri" w:hAnsi="Calibri"/>
                 <w:sz w:val="21"/>
               </w:rPr>
-              <w:t>Check if the void reason is empty: click Void on a sale, leave the reason empty, then click Void Sale</w:t>
+              <w:t>Check if the void reason is empty: click Void on a sale, leave the reason empty, then click Void Sale. The reason is required before POST /api/sales/(id)/void is sent</w:t>
             </w:r>
           </w:p>
         </w:tc>
@@ -3879,7 +3879,7 @@
                 <w:rFonts w:ascii="Calibri" w:hAnsi="Calibri"/>
                 <w:sz w:val="21"/>
               </w:rPr>
-              <w:t>A message "A reason is required to void a sale" is displayed</w:t>
+              <w:t>"A reason is required to void a sale" is displayed and sales.payment_status stays 'completed'</w:t>
             </w:r>
           </w:p>
         </w:tc>
@@ -4019,7 +4019,7 @@
                 <w:rFonts w:ascii="Calibri" w:hAnsi="Calibri"/>
                 <w:sz w:val="21"/>
               </w:rPr>
-              <w:t>Check if From is later than To: choose a From date later than the To date, then click Filter</w:t>
+              <w:t>Check if From is later than To: choose a From date later than the To date, then click Filter. The date range is checked before the sales are fetched</w:t>
             </w:r>
           </w:p>
         </w:tc>
@@ -4037,7 +4037,7 @@
                 <w:rFonts w:ascii="Calibri" w:hAnsi="Calibri"/>
                 <w:sz w:val="21"/>
               </w:rPr>
-              <w:t>A message "The start date is after the end date" is displayed</w:t>
+              <w:t>"The start date is after the end date" is displayed and no sales are listed for the reversed range</w:t>
             </w:r>
           </w:p>
         </w:tc>
@@ -4177,7 +4177,7 @@
                 <w:rFonts w:ascii="Calibri" w:hAnsi="Calibri"/>
                 <w:sz w:val="21"/>
               </w:rPr>
-              <w:t>Check if a voided sale is left out of the total: look at a voided sale in the list</w:t>
+              <w:t>Check if a voided sale is left out of the total: find a voided sale (sales.payment_status 'voided') in the Sales History list</w:t>
             </w:r>
           </w:p>
         </w:tc>
@@ -4195,7 +4195,7 @@
                 <w:rFonts w:ascii="Calibri" w:hAnsi="Calibri"/>
                 <w:sz w:val="21"/>
               </w:rPr>
-              <w:t>It is marked Voided and is not counted in Total Sales Amount</w:t>
+              <w:t>Its row reads Voided and its final_amount is not part of Total Sales Amount, which sums only sales that are not voided</w:t>
             </w:r>
           </w:p>
         </w:tc>
@@ -4335,7 +4335,7 @@
                 <w:rFonts w:ascii="Calibri" w:hAnsi="Calibri"/>
                 <w:sz w:val="21"/>
               </w:rPr>
-              <w:t>Check if the end-of-day count is saved: click End of day, enter the cash counted, then click Save count</w:t>
+              <w:t>Check if the end-of-day count is saved: click End of day, enter the cash counted, then click Save count. POST /api/sales/eod works out the expected cash: opening cash + cash sales + cash in − cash out</w:t>
             </w:r>
           </w:p>
         </w:tc>
@@ -4353,7 +4353,7 @@
                 <w:rFonts w:ascii="Calibri" w:hAnsi="Calibri"/>
                 <w:sz w:val="21"/>
               </w:rPr>
-              <w:t>The count is saved with Balanced, Over by or Short by</w:t>
+              <w:t>A cash_reconciliations row is saved with expected_cash, counted_cash and discrepancy (counted − expected), shown as Balanced, Over by or Short by</w:t>
             </w:r>
           </w:p>
         </w:tc>
@@ -4493,7 +4493,7 @@
                 <w:rFonts w:ascii="Calibri" w:hAnsi="Calibri"/>
                 <w:sz w:val="21"/>
               </w:rPr>
-              <w:t>Check if a sale is voided: click Void on a sale, enter the reason, then click Void Sale</w:t>
+              <w:t>Check if a sale is voided: click Void on a sale, enter the reason, then click Void Sale. POST /api/sales/(id)/void runs as one transaction</w:t>
             </w:r>
           </w:p>
         </w:tc>
@@ -4511,7 +4511,7 @@
                 <w:rFonts w:ascii="Calibri" w:hAnsi="Calibri"/>
                 <w:sz w:val="21"/>
               </w:rPr>
-              <w:t>A message "Sale voided" is displayed, the items return to stock and the status reads Voided</w:t>
+              <w:t>sales.payment_status becomes 'voided' with the reason added to notes, each item's stock_quantity goes back up with an 'in' stock_movements row (reference 'sale_void'), an audit_logs row is written, and "Sale voided" is displayed</w:t>
             </w:r>
           </w:p>
         </w:tc>
@@ -4735,7 +4735,7 @@
                 <w:rFonts w:ascii="Calibri" w:hAnsi="Calibri"/>
                 <w:sz w:val="21"/>
               </w:rPr>
-              <w:t>Check if Supplier name is empty: click Add supplier, leave Supplier name empty, then click Save supplier</w:t>
+              <w:t>Check if Supplier name is empty: click Add supplier, leave Supplier name empty, then click Save supplier. The required field is checked in the browser before POST /api/suppliers is sent</w:t>
             </w:r>
           </w:p>
         </w:tc>
@@ -4753,7 +4753,7 @@
                 <w:rFonts w:ascii="Calibri" w:hAnsi="Calibri"/>
                 <w:sz w:val="21"/>
               </w:rPr>
-              <w:t>A tooltip "Please fill out this field." is displayed on Supplier name</w:t>
+              <w:t>The tooltip "Please fill out this field." is displayed on Supplier name and no row is inserted in suppliers</w:t>
             </w:r>
           </w:p>
         </w:tc>
@@ -4893,7 +4893,7 @@
                 <w:rFonts w:ascii="Calibri" w:hAnsi="Calibri"/>
                 <w:sz w:val="21"/>
               </w:rPr>
-              <w:t>Check if the email has no @: enter an email without @, then click Save supplier</w:t>
+              <w:t>Check if the email has no @: enter an email without @, then click Save supplier. The email field is checked in the browser</w:t>
             </w:r>
           </w:p>
         </w:tc>
@@ -4911,7 +4911,7 @@
                 <w:rFonts w:ascii="Calibri" w:hAnsi="Calibri"/>
                 <w:sz w:val="21"/>
               </w:rPr>
-              <w:t>A tooltip "Please include an '@' in the email address." is displayed</w:t>
+              <w:t>The tooltip "Please include an '@' in the email address." is displayed and the supplier is not saved</w:t>
             </w:r>
           </w:p>
         </w:tc>
@@ -5069,7 +5069,7 @@
                 <w:rFonts w:ascii="Calibri" w:hAnsi="Calibri"/>
                 <w:sz w:val="21"/>
               </w:rPr>
-              <w:t>A message "The expiration date cannot be earlier than today." is displayed</w:t>
+              <w:t>"The expiration date cannot be earlier than today." is displayed; the order is not marked received and stock_quantity does not change</w:t>
             </w:r>
           </w:p>
         </w:tc>
@@ -5209,7 +5209,7 @@
                 <w:rFonts w:ascii="Calibri" w:hAnsi="Calibri"/>
                 <w:sz w:val="21"/>
               </w:rPr>
-              <w:t>Check if the Rating matches Performance: look at the Rating column, then click Performance on the same supplier</w:t>
+              <w:t>Check if the Rating matches Performance: read a supplier's stars in the Rating column, then click Performance on the same supplier. Both use the same rating rule: 4 stars or more meets the standard</w:t>
             </w:r>
           </w:p>
         </w:tc>
@@ -5367,7 +5367,7 @@
                 <w:rFonts w:ascii="Calibri" w:hAnsi="Calibri"/>
                 <w:sz w:val="21"/>
               </w:rPr>
-              <w:t>Check if the supplier name is already used: click Add supplier and enter a name that is already on the list, then click Save supplier</w:t>
+              <w:t>Check if the supplier name is already used: click Add supplier, enter a name that is already in suppliers, then click Save supplier. POST /api/suppliers looks for a supplier with the same name</w:t>
             </w:r>
           </w:p>
         </w:tc>
@@ -5385,7 +5385,7 @@
                 <w:rFonts w:ascii="Calibri" w:hAnsi="Calibri"/>
                 <w:sz w:val="21"/>
               </w:rPr>
-              <w:t>A message "A supplier with this name is already on the list." is displayed</w:t>
+              <w:t>HTTP 409 with "A supplier with this name is already on the list." and no second row is inserted</w:t>
             </w:r>
           </w:p>
         </w:tc>
@@ -5525,7 +5525,7 @@
                 <w:rFonts w:ascii="Calibri" w:hAnsi="Calibri"/>
                 <w:sz w:val="21"/>
               </w:rPr>
-              <w:t>Check if receiving an order adds the stock: open the Orders view, click Receive into stock on an order, then confirm</w:t>
+              <w:t>Check if receiving an order adds the stock: open the Orders view, click Receive into stock on an order, then confirm. PUT /api/purchase-orders/(id)/status 'received' runs as one transaction</w:t>
             </w:r>
           </w:p>
         </w:tc>
@@ -5543,7 +5543,7 @@
                 <w:rFonts w:ascii="Calibri" w:hAnsi="Calibri"/>
                 <w:sz w:val="21"/>
               </w:rPr>
-              <w:t>The order is received and the stock goes up by the quantities received</w:t>
+              <w:t>purchase_orders.status becomes 'received' with received_at set, each product's stock_quantity goes up by the quantity received, and a stock_movements row 'purchase' (reference 'purchase_order') is added for each item</w:t>
             </w:r>
           </w:p>
         </w:tc>
@@ -5767,7 +5767,7 @@
                 <w:rFonts w:ascii="Calibri" w:hAnsi="Calibri"/>
                 <w:sz w:val="21"/>
               </w:rPr>
-              <w:t>Check if the custom dates are empty: click Custom, clear both dates, then click Apply</w:t>
+              <w:t>Check if the custom dates are empty: in Reports, click Custom, clear both dates, then click Apply</w:t>
             </w:r>
           </w:p>
         </w:tc>
@@ -5785,7 +5785,7 @@
                 <w:rFonts w:ascii="Calibri" w:hAnsi="Calibri"/>
                 <w:sz w:val="21"/>
               </w:rPr>
-              <w:t>A message "Choose both a start and an end date" is displayed</w:t>
+              <w:t>"Choose both a start and an end date" is displayed and no report is produced</w:t>
             </w:r>
           </w:p>
         </w:tc>
@@ -5925,7 +5925,7 @@
                 <w:rFonts w:ascii="Calibri" w:hAnsi="Calibri"/>
                 <w:sz w:val="21"/>
               </w:rPr>
-              <w:t>Check if From is later than To: click Custom, choose a From date later than the To date, then click Apply</w:t>
+              <w:t>Check if From is later than To: in Reports, click Custom, choose a From date later than the To date, then click Apply</w:t>
             </w:r>
           </w:p>
         </w:tc>
@@ -5943,7 +5943,7 @@
                 <w:rFonts w:ascii="Calibri" w:hAnsi="Calibri"/>
                 <w:sz w:val="21"/>
               </w:rPr>
-              <w:t>A message "The start date is after the end date" is displayed</w:t>
+              <w:t>"The start date is after the end date" is displayed and no report is produced</w:t>
             </w:r>
           </w:p>
         </w:tc>
@@ -6083,7 +6083,7 @@
                 <w:rFonts w:ascii="Calibri" w:hAnsi="Calibri"/>
                 <w:sz w:val="21"/>
               </w:rPr>
-              <w:t>Check if the category lines add up to Revenue: choose All time and look at the lines under Sales by category</w:t>
+              <w:t>Check if the category lines add up to Revenue: choose All time and read the lines under Sales by category. The lines come from sale_items grouped by category, the sales recorded without items, and the discounts</w:t>
             </w:r>
           </w:p>
         </w:tc>
@@ -6101,7 +6101,7 @@
                 <w:rFonts w:ascii="Calibri" w:hAnsi="Calibri"/>
                 <w:sz w:val="21"/>
               </w:rPr>
-              <w:t>"Items sold, all categories", "Sales recorded without items", "Discounts given" and "Revenue" are listed and add up to Revenue</w:t>
+              <w:t>"Items sold, all categories" + "Sales recorded without items" − "Discounts given" equals "Revenue", the sum of sales.final_amount for sales that are not voided</w:t>
             </w:r>
           </w:p>
         </w:tc>
@@ -6241,7 +6241,7 @@
                 <w:rFonts w:ascii="Calibri" w:hAnsi="Calibri"/>
                 <w:sz w:val="21"/>
               </w:rPr>
-              <w:t>Check if a voided sale is left out of revenue: void a sale, then look at Revenue for that day</w:t>
+              <w:t>Check if a voided sale is left out of revenue: void a sale, then reload the Sales report for that day. Revenue leaves out sales whose payment_status is 'voided'</w:t>
             </w:r>
           </w:p>
         </w:tc>
@@ -6259,7 +6259,7 @@
                 <w:rFonts w:ascii="Calibri" w:hAnsi="Calibri"/>
                 <w:sz w:val="21"/>
               </w:rPr>
-              <w:t>The voided sale is not counted</w:t>
+              <w:t>Revenue for that day goes down by the voided sale's final_amount</w:t>
             </w:r>
           </w:p>
         </w:tc>
@@ -6483,7 +6483,7 @@
                 <w:rFonts w:ascii="Calibri" w:hAnsi="Calibri"/>
                 <w:sz w:val="21"/>
               </w:rPr>
-              <w:t>Check if What to reorder lists only products to order: look at the What to reorder table</w:t>
+              <w:t>Check if What to reorder lists only products to order: open Stock Planning and read the What to reorder table. It is built from the sales forecast, the stock on hand and the orders still open</w:t>
             </w:r>
           </w:p>
         </w:tc>
@@ -6641,7 +6641,7 @@
                 <w:rFonts w:ascii="Calibri" w:hAnsi="Calibri"/>
                 <w:sz w:val="21"/>
               </w:rPr>
-              <w:t>Check if the reorder list is exported: click Export list when products need reordering</w:t>
+              <w:t>Check if the reorder list is exported: click Export list when products need reordering. The list is written to a CSV file</w:t>
             </w:r>
           </w:p>
         </w:tc>
@@ -6659,7 +6659,7 @@
                 <w:rFonts w:ascii="Calibri" w:hAnsi="Calibri"/>
                 <w:sz w:val="21"/>
               </w:rPr>
-              <w:t>The reorder list is saved and a message "Reorder list exported" is displayed</w:t>
+              <w:t>reorder_list_(YYYY-MM-DD).csv is downloaded with the columns Product, SKU, Supplier, Status, Why, In stock, On order … Suggested order, and "Reorder list exported" is displayed</w:t>
             </w:r>
           </w:p>
         </w:tc>
@@ -6883,7 +6883,7 @@
                 <w:rFonts w:ascii="Calibri" w:hAnsi="Calibri"/>
                 <w:sz w:val="21"/>
               </w:rPr>
-              <w:t>Check if the activity log filters match: click the Activity log tab, then choose an action and an area</w:t>
+              <w:t>Check if the activity log filters match: click the Activity log tab, then choose an action and an area. GET /api/audit?action=(action)&amp;table_name=(area) filters audit_logs</w:t>
             </w:r>
           </w:p>
         </w:tc>
@@ -6901,7 +6901,7 @@
                 <w:rFonts w:ascii="Calibri" w:hAnsi="Calibri"/>
                 <w:sz w:val="21"/>
               </w:rPr>
-              <w:t>Only the records of that action and that area are listed</w:t>
+              <w:t>Only audit_logs rows with that action and that table_name are listed</w:t>
             </w:r>
           </w:p>
         </w:tc>
@@ -7041,7 +7041,7 @@
                 <w:rFonts w:ascii="Calibri" w:hAnsi="Calibri"/>
                 <w:sz w:val="21"/>
               </w:rPr>
-              <w:t>Check if a requested sale is voided: click Void sale on a request, then confirm</w:t>
+              <w:t>Check if a requested sale is voided: in Void Requests, click Void sale on a request, then confirm. POST /api/sales/(id)/void runs as one transaction</w:t>
             </w:r>
           </w:p>
         </w:tc>
@@ -7059,7 +7059,7 @@
                 <w:rFonts w:ascii="Calibri" w:hAnsi="Calibri"/>
                 <w:sz w:val="21"/>
               </w:rPr>
-              <w:t>"Sale voided and its items returned to stock" is displayed and the request leaves Waiting for a decision</w:t>
+              <w:t>sales.payment_status becomes 'voided', the items go back into stock_quantity with 'in' stock_movements rows, "Sale voided and its items returned to stock" is displayed and the request leaves Waiting for a decision</w:t>
             </w:r>
           </w:p>
         </w:tc>
@@ -7283,7 +7283,7 @@
                 <w:rFonts w:ascii="Calibri" w:hAnsi="Calibri"/>
                 <w:sz w:val="21"/>
               </w:rPr>
-              <w:t>Check if Low Stock lists only low-stock notices: choose Low Stock in All Types</w:t>
+              <w:t>Check if Low Stock lists only low-stock notices: choose Low Stock in All Types. The list is filtered to notifications.type 'low_stock'</w:t>
             </w:r>
           </w:p>
         </w:tc>
@@ -7358,7 +7358,7 @@
                 <w:rFonts w:ascii="Calibri" w:hAnsi="Calibri"/>
                 <w:sz w:val="21"/>
               </w:rPr>
-              <w:t>Check if Mark all read marks every notice: click Mark all read</w:t>
+              <w:t>Check if Mark all read marks every notice: click Mark all read. PUT /api/notifications/read-all sets is_read = TRUE on the unread notices of this user and the shop-wide ones</w:t>
             </w:r>
           </w:p>
         </w:tc>
@@ -7376,7 +7376,7 @@
                 <w:rFonts w:ascii="Calibri" w:hAnsi="Calibri"/>
                 <w:sz w:val="21"/>
               </w:rPr>
-              <w:t>A message "All notifications marked as read" is displayed and the unread count is 0</w:t>
+              <w:t>"All notifications marked as read" is displayed, every notice shows as read and the unread count on the bell is 0</w:t>
             </w:r>
           </w:p>
         </w:tc>
@@ -7600,7 +7600,7 @@
                 <w:rFonts w:ascii="Calibri" w:hAnsi="Calibri"/>
                 <w:sz w:val="21"/>
               </w:rPr>
-              <w:t>Check if Full name is empty: click Add user, leave Full name empty, then click Create user</w:t>
+              <w:t>Check if Full name is empty: click Add user, leave Full name empty, then click Create user. The required field is checked in the browser</w:t>
             </w:r>
           </w:p>
         </w:tc>
@@ -7618,7 +7618,7 @@
                 <w:rFonts w:ascii="Calibri" w:hAnsi="Calibri"/>
                 <w:sz w:val="21"/>
               </w:rPr>
-              <w:t>A tooltip "Please fill out this field." is displayed on Full name</w:t>
+              <w:t>The tooltip "Please fill out this field." is displayed on Full name and no row is inserted in users</w:t>
             </w:r>
           </w:p>
         </w:tc>
@@ -7758,7 +7758,7 @@
                 <w:rFonts w:ascii="Calibri" w:hAnsi="Calibri"/>
                 <w:sz w:val="21"/>
               </w:rPr>
-              <w:t>Check if the password has no number: enter a password without a number, then click Create user</w:t>
+              <w:t>Check if the password has no number: enter a password without a number, then click Create user. The password policy is checked before the account is saved</w:t>
             </w:r>
           </w:p>
         </w:tc>
@@ -7776,7 +7776,7 @@
                 <w:rFonts w:ascii="Calibri" w:hAnsi="Calibri"/>
                 <w:sz w:val="21"/>
               </w:rPr>
-              <w:t>A message "Password too weak" is displayed with "Add at least one number (0–9)."</w:t>
+              <w:t>"Password too weak" is displayed with "Add at least one number (0–9)." and no row is inserted in users</w:t>
             </w:r>
           </w:p>
         </w:tc>
@@ -7916,7 +7916,7 @@
                 <w:rFonts w:ascii="Calibri" w:hAnsi="Calibri"/>
                 <w:sz w:val="21"/>
               </w:rPr>
-              <w:t>Check if the password is shorter than 6 characters: enter a password with fewer than 6 characters, then click Create user</w:t>
+              <w:t>Check if the password is shorter than 6 characters: enter a password with fewer than 6 characters, then click Create user. The field's 6-character minimum is checked in the browser</w:t>
             </w:r>
           </w:p>
         </w:tc>
@@ -7934,7 +7934,7 @@
                 <w:rFonts w:ascii="Calibri" w:hAnsi="Calibri"/>
                 <w:sz w:val="21"/>
               </w:rPr>
-              <w:t>A tooltip "Please lengthen this text to 6 characters or more (you are currently using (number) characters)." is displayed on Password</w:t>
+              <w:t>The tooltip "Please lengthen this text to 6 characters or more (you are currently using (number) characters)." is displayed on Password and the account is not created</w:t>
             </w:r>
           </w:p>
         </w:tc>
@@ -8074,7 +8074,7 @@
                 <w:rFonts w:ascii="Calibri" w:hAnsi="Calibri"/>
                 <w:sz w:val="21"/>
               </w:rPr>
-              <w:t>Check if you can deactivate your own account: look at your own row in the Users list</w:t>
+              <w:t>Check if you can deactivate your own account: find your own row in the Users list. The Deactivate button is left out where the row's user id is the signed-in user's id</w:t>
             </w:r>
           </w:p>
         </w:tc>
@@ -8092,7 +8092,7 @@
                 <w:rFonts w:ascii="Calibri" w:hAnsi="Calibri"/>
                 <w:sz w:val="21"/>
               </w:rPr>
-              <w:t>There is no Deactivate button on your own account</w:t>
+              <w:t>There is no Deactivate button on your own row, so an Administrator cannot lock themselves out</w:t>
             </w:r>
           </w:p>
         </w:tc>
@@ -8232,7 +8232,7 @@
                 <w:rFonts w:ascii="Calibri" w:hAnsi="Calibri"/>
                 <w:sz w:val="21"/>
               </w:rPr>
-              <w:t>Check if the username is already taken: enter a username that is already taken</w:t>
+              <w:t>Check if the username is already taken: click Add user, enter a username that is already in users, then click Create user. The server looks for the username among all accounts, deactivated ones included</w:t>
             </w:r>
           </w:p>
         </w:tc>
@@ -8250,7 +8250,7 @@
                 <w:rFonts w:ascii="Calibri" w:hAnsi="Calibri"/>
                 <w:sz w:val="21"/>
               </w:rPr>
-              <w:t>A message "Username already taken" is displayed</w:t>
+              <w:t>HTTP 400 with "Username already taken" and no row is inserted in users</w:t>
             </w:r>
           </w:p>
         </w:tc>
@@ -8390,7 +8390,7 @@
                 <w:rFonts w:ascii="Calibri" w:hAnsi="Calibri"/>
                 <w:sz w:val="21"/>
               </w:rPr>
-              <w:t>Check if an account is deactivated: click Deactivate on another user, then click Yes, deactivate</w:t>
+              <w:t>Check if an account is deactivated: click Deactivate on another user, then click Yes, deactivate. users.is_active is set to FALSE and token_version goes up by 1</w:t>
             </w:r>
           </w:p>
         </w:tc>
@@ -8408,7 +8408,7 @@
                 <w:rFonts w:ascii="Calibri" w:hAnsi="Calibri"/>
                 <w:sz w:val="21"/>
               </w:rPr>
-              <w:t>A message "Account deactivated" is displayed and that user can no longer sign in</w:t>
+              <w:t>"Account deactivated" is displayed, that user's open sessions stop working at their next request, and a new sign-in is refused with "Invalid username or password"</w:t>
             </w:r>
           </w:p>
         </w:tc>
@@ -8650,7 +8650,7 @@
                 <w:rFonts w:ascii="Calibri" w:hAnsi="Calibri"/>
                 <w:sz w:val="21"/>
               </w:rPr>
-              <w:t>A message "Please enter your full name" is displayed</w:t>
+              <w:t>"Please enter your full name" is displayed and users.full_name is not changed</w:t>
             </w:r>
           </w:p>
         </w:tc>
@@ -8790,7 +8790,7 @@
                 <w:rFonts w:ascii="Calibri" w:hAnsi="Calibri"/>
                 <w:sz w:val="21"/>
               </w:rPr>
-              <w:t>Check if the email has no @: in Profile, enter an email without @, then click Save changes</w:t>
+              <w:t>Check if the email has no @: in Profile, enter an email without @, then click Save changes. The email format is checked before users.email is updated</w:t>
             </w:r>
           </w:p>
         </w:tc>
@@ -8808,7 +8808,7 @@
                 <w:rFonts w:ascii="Calibri" w:hAnsi="Calibri"/>
                 <w:sz w:val="21"/>
               </w:rPr>
-              <w:t>A message "Please enter a valid email address" is displayed</w:t>
+              <w:t>"Please enter a valid email address" is displayed and users.email is not changed</w:t>
             </w:r>
           </w:p>
         </w:tc>
@@ -8948,7 +8948,7 @@
                 <w:rFonts w:ascii="Calibri" w:hAnsi="Calibri"/>
                 <w:sz w:val="21"/>
               </w:rPr>
-              <w:t>Check if the discount limit is above 100: enter 150 in "Largest discount a cashier can give (%)", then click Save limit</w:t>
+              <w:t>Check if the discount limit is above 100: enter 150 in "Largest discount a cashier can give (%)", then click Save limit. The limit is kept in app_settings (pos_max_discount_percent) and must be 0 to 100</w:t>
             </w:r>
           </w:p>
         </w:tc>
@@ -8966,7 +8966,7 @@
                 <w:rFonts w:ascii="Calibri" w:hAnsi="Calibri"/>
                 <w:sz w:val="21"/>
               </w:rPr>
-              <w:t>A message "Enter a limit between 0 and 100" is displayed</w:t>
+              <w:t>"Enter a limit between 0 and 100" is displayed and the saved limit does not change</w:t>
             </w:r>
           </w:p>
         </w:tc>
@@ -9106,7 +9106,7 @@
                 <w:rFonts w:ascii="Calibri" w:hAnsi="Calibri"/>
                 <w:sz w:val="21"/>
               </w:rPr>
-              <w:t>Check if the two passwords do not match: in Password, enter a different password in Confirm new password</w:t>
+              <w:t>Check if the two passwords do not match: in Password, enter one new password and a different one in Confirm new password</w:t>
             </w:r>
           </w:p>
         </w:tc>
@@ -9124,7 +9124,7 @@
                 <w:rFonts w:ascii="Calibri" w:hAnsi="Calibri"/>
                 <w:sz w:val="21"/>
               </w:rPr>
-              <w:t>A message "Passwords do not match" is displayed</w:t>
+              <w:t>"Passwords do not match" is displayed and the password is not changed</w:t>
             </w:r>
           </w:p>
         </w:tc>
@@ -9264,7 +9264,7 @@
                 <w:rFonts w:ascii="Calibri" w:hAnsi="Calibri"/>
                 <w:sz w:val="21"/>
               </w:rPr>
-              <w:t>Check if the current password is wrong: in Password, enter a wrong current password, then click Update password</w:t>
+              <w:t>Check if the current password is wrong: in Password, enter a wrong current password, then click Update password. The current password is compared with the bcrypt hash in users.password</w:t>
             </w:r>
           </w:p>
         </w:tc>
@@ -9282,7 +9282,7 @@
                 <w:rFonts w:ascii="Calibri" w:hAnsi="Calibri"/>
                 <w:sz w:val="21"/>
               </w:rPr>
-              <w:t>A message "Password not changed" is displayed with "Current password is incorrect"</w:t>
+              <w:t>HTTP 400: "Password not changed" is displayed with "Current password is incorrect" and users.password is not changed</w:t>
             </w:r>
           </w:p>
         </w:tc>
@@ -9440,7 +9440,7 @@
                 <w:rFonts w:ascii="Calibri" w:hAnsi="Calibri"/>
                 <w:sz w:val="21"/>
               </w:rPr>
-              <w:t>A message "Password changed" is displayed, and the new password works the next time the user signs in</w:t>
+              <w:t>users.password is replaced by a new bcrypt hash and token_version goes up (other sessions are signed out); "Password changed" is displayed and the new password works at the next sign-in</w:t>
             </w:r>
           </w:p>
         </w:tc>

</xml_diff>

<commit_message>
UAT follows the system changes of 25-26 Oct
Two tests rewritten because the Stock button is gone: removing more than
is on hand now uses bulk Adjust stock (10-11), and expired stock is
written off when an order is received (12-05). The receive date test
uses the 7-day rule (19-03). Five new tests: barcode length, a bulk
quantity that is not a whole number, an expiration date less than 7
days away, a picture over 10 MB, and an end-of-day date in the future.
Administrator 58, All roles 99. The CSUQ needed no change.

Co-Authored-By: Claude Opus 5.5 <noreply@anthropic.com>
</commit_message>
<xml_diff>
--- a/QA/FETCH-UAT-Administrator.docx
+++ b/QA/FETCH-UAT-Administrator.docx
@@ -2354,7 +2354,7 @@
                 <w:rFonts w:ascii="Calibri" w:hAnsi="Calibri"/>
                 <w:sz w:val="21"/>
               </w:rPr>
-              <w:t>Check if the product counts match Inventory: compare Total Products, Restock Needed and Expiring Soon on the Dashboard with the matching cards in Inventory. Both pages count the products table with the same query</w:t>
+              <w:t>Check if the product counts match Inventory: compare Total Products, Restock Needed and Expiring Soon on the Dashboard with the matching figures in Inventory. Both pages count the products table with the same query</w:t>
             </w:r>
           </w:p>
         </w:tc>
@@ -2964,6 +2964,156 @@
         <w:tc>
           <w:tcPr>
             <w:tcW w:type="dxa" w:w="600"/>
+          </w:tcPr>
+          <w:p/>
+        </w:tc>
+        <w:tc>
+          <w:tcPr>
+            <w:tcW w:type="dxa" w:w="2300"/>
+          </w:tcPr>
+          <w:p/>
+        </w:tc>
+        <w:tc>
+          <w:tcPr>
+            <w:tcW w:type="dxa" w:w="4500"/>
+          </w:tcPr>
+          <w:p>
+            <w:pPr>
+              <w:spacing w:after="0"/>
+            </w:pPr>
+            <w:r/>
+            <w:r>
+              <w:rPr>
+                <w:rFonts w:ascii="Calibri" w:hAnsi="Calibri"/>
+                <w:sz w:val="21"/>
+              </w:rPr>
+              <w:t>Check if the barcode is not 8, 12 or 13 digits: click Add, type 1111 in Barcode, then click Save product. A barcode must be 8, 12 or 13 digits, numbers only (EAN-8, UPC-A or EAN-13)</w:t>
+            </w:r>
+          </w:p>
+        </w:tc>
+        <w:tc>
+          <w:tcPr>
+            <w:tcW w:type="dxa" w:w="4700"/>
+          </w:tcPr>
+          <w:p>
+            <w:pPr>
+              <w:spacing w:after="0"/>
+            </w:pPr>
+            <w:r/>
+            <w:r>
+              <w:rPr>
+                <w:rFonts w:ascii="Calibri" w:hAnsi="Calibri"/>
+                <w:sz w:val="21"/>
+              </w:rPr>
+              <w:t>"A barcode is 8, 12 or 13 digits. This one has 4." is displayed under Barcode; POST /api/products is refused with HTTP 400 and no row is inserted in products</w:t>
+            </w:r>
+          </w:p>
+        </w:tc>
+        <w:tc>
+          <w:tcPr>
+            <w:tcW w:type="dxa" w:w="2100"/>
+          </w:tcPr>
+          <w:p/>
+        </w:tc>
+        <w:tc>
+          <w:tcPr>
+            <w:tcW w:type="dxa" w:w="1520"/>
+          </w:tcPr>
+          <w:p/>
+        </w:tc>
+        <w:tc>
+          <w:tcPr>
+            <w:tcW w:type="dxa" w:w="1100"/>
+          </w:tcPr>
+          <w:p/>
+        </w:tc>
+      </w:tr>
+      <w:tr>
+        <w:tc>
+          <w:tcPr>
+            <w:tcW w:type="dxa" w:w="1900"/>
+            <w:vMerge/>
+          </w:tcPr>
+          <w:p/>
+        </w:tc>
+        <w:tc>
+          <w:tcPr>
+            <w:tcW w:type="dxa" w:w="600"/>
+          </w:tcPr>
+          <w:p/>
+        </w:tc>
+        <w:tc>
+          <w:tcPr>
+            <w:tcW w:type="dxa" w:w="2300"/>
+          </w:tcPr>
+          <w:p/>
+        </w:tc>
+        <w:tc>
+          <w:tcPr>
+            <w:tcW w:type="dxa" w:w="4500"/>
+          </w:tcPr>
+          <w:p>
+            <w:pPr>
+              <w:spacing w:after="0"/>
+            </w:pPr>
+            <w:r/>
+            <w:r>
+              <w:rPr>
+                <w:rFonts w:ascii="Calibri" w:hAnsi="Calibri"/>
+                <w:sz w:val="21"/>
+              </w:rPr>
+              <w:t>Check if the bulk quantity is not a whole number: tick a product, click Adjust stock, choose Add stock, type 10+10, then click Continue. The quantity must be one whole number above 0</w:t>
+            </w:r>
+          </w:p>
+        </w:tc>
+        <w:tc>
+          <w:tcPr>
+            <w:tcW w:type="dxa" w:w="4700"/>
+          </w:tcPr>
+          <w:p>
+            <w:pPr>
+              <w:spacing w:after="0"/>
+            </w:pPr>
+            <w:r/>
+            <w:r>
+              <w:rPr>
+                <w:rFonts w:ascii="Calibri" w:hAnsi="Calibri"/>
+                <w:sz w:val="21"/>
+              </w:rPr>
+              <w:t>""10+10" is not a whole number. Type one number only, like 10 (no + or - signs, no letters). Use Add stock or Remove stock above to choose which." is displayed in the dialog and no stock change is sent</w:t>
+            </w:r>
+          </w:p>
+        </w:tc>
+        <w:tc>
+          <w:tcPr>
+            <w:tcW w:type="dxa" w:w="2100"/>
+          </w:tcPr>
+          <w:p/>
+        </w:tc>
+        <w:tc>
+          <w:tcPr>
+            <w:tcW w:type="dxa" w:w="1520"/>
+          </w:tcPr>
+          <w:p/>
+        </w:tc>
+        <w:tc>
+          <w:tcPr>
+            <w:tcW w:type="dxa" w:w="1100"/>
+          </w:tcPr>
+          <w:p/>
+        </w:tc>
+      </w:tr>
+      <w:tr>
+        <w:tc>
+          <w:tcPr>
+            <w:tcW w:type="dxa" w:w="1900"/>
+            <w:vMerge/>
+          </w:tcPr>
+          <w:p/>
+        </w:tc>
+        <w:tc>
+          <w:tcPr>
+            <w:tcW w:type="dxa" w:w="600"/>
             <w:shd w:val="clear" w:color="auto" w:fill="D0CECE"/>
           </w:tcPr>
           <w:p>
@@ -3070,7 +3220,7 @@
                 <w:rFonts w:ascii="Calibri" w:hAnsi="Calibri"/>
                 <w:sz w:val="21"/>
               </w:rPr>
-              <w:t>Check if more stock is removed than is on hand: click Stock on a product with 20 in stock, choose "Remove stock (taken out)", enter 999, then click Save adjustment. PUT /api/products/(id)/stock locks the product row and compares 999 with stock_quantity</w:t>
+              <w:t>Check if more stock is removed than is on hand: tick a product with 20 in stock, click Adjust stock, choose Remove stock, enter 999, click Continue, then Yes, Adjust. PUT /api/products/(id)/stock locks the product row and compares 999 with stock_quantity</w:t>
             </w:r>
           </w:p>
         </w:tc>
@@ -3088,7 +3238,157 @@
                 <w:rFonts w:ascii="Calibri" w:hAnsi="Calibri"/>
                 <w:sz w:val="21"/>
               </w:rPr>
-              <w:t>HTTP 400 with "Only 20 in stock: you cannot remove 999." The change is rolled back: stock_quantity stays 20 and no stock_movements row is added</w:t>
+              <w:t>The result lists the product under Not changed with "Only 20 in stock: you cannot remove 999." (HTTP 400). The change is rolled back: stock_quantity stays 20 and no stock_movements row is added</w:t>
+            </w:r>
+          </w:p>
+        </w:tc>
+        <w:tc>
+          <w:tcPr>
+            <w:tcW w:type="dxa" w:w="2100"/>
+          </w:tcPr>
+          <w:p/>
+        </w:tc>
+        <w:tc>
+          <w:tcPr>
+            <w:tcW w:type="dxa" w:w="1520"/>
+          </w:tcPr>
+          <w:p/>
+        </w:tc>
+        <w:tc>
+          <w:tcPr>
+            <w:tcW w:type="dxa" w:w="1100"/>
+          </w:tcPr>
+          <w:p/>
+        </w:tc>
+      </w:tr>
+      <w:tr>
+        <w:tc>
+          <w:tcPr>
+            <w:tcW w:type="dxa" w:w="1900"/>
+            <w:vMerge/>
+          </w:tcPr>
+          <w:p/>
+        </w:tc>
+        <w:tc>
+          <w:tcPr>
+            <w:tcW w:type="dxa" w:w="600"/>
+          </w:tcPr>
+          <w:p/>
+        </w:tc>
+        <w:tc>
+          <w:tcPr>
+            <w:tcW w:type="dxa" w:w="2300"/>
+          </w:tcPr>
+          <w:p/>
+        </w:tc>
+        <w:tc>
+          <w:tcPr>
+            <w:tcW w:type="dxa" w:w="4500"/>
+          </w:tcPr>
+          <w:p>
+            <w:pPr>
+              <w:spacing w:after="0"/>
+            </w:pPr>
+            <w:r/>
+            <w:r>
+              <w:rPr>
+                <w:rFonts w:ascii="Calibri" w:hAnsi="Calibri"/>
+                <w:sz w:val="21"/>
+              </w:rPr>
+              <w:t>Check if the expiration date is less than 7 days away: click Add and enter today's date in Expiration date. The date picker starts 7 days ahead, and a typed date is checked as soon as it is complete</w:t>
+            </w:r>
+          </w:p>
+        </w:tc>
+        <w:tc>
+          <w:tcPr>
+            <w:tcW w:type="dxa" w:w="4700"/>
+          </w:tcPr>
+          <w:p>
+            <w:pPr>
+              <w:spacing w:after="0"/>
+            </w:pPr>
+            <w:r/>
+            <w:r>
+              <w:rPr>
+                <w:rFonts w:ascii="Calibri" w:hAnsi="Calibri"/>
+                <w:sz w:val="21"/>
+              </w:rPr>
+              <w:t>"The expiration date must be at least 7 days from today: (date) or later." is displayed under Expiration date; saving is refused with HTTP 400 and products.expiration_date is not set</w:t>
+            </w:r>
+          </w:p>
+        </w:tc>
+        <w:tc>
+          <w:tcPr>
+            <w:tcW w:type="dxa" w:w="2100"/>
+          </w:tcPr>
+          <w:p/>
+        </w:tc>
+        <w:tc>
+          <w:tcPr>
+            <w:tcW w:type="dxa" w:w="1520"/>
+          </w:tcPr>
+          <w:p/>
+        </w:tc>
+        <w:tc>
+          <w:tcPr>
+            <w:tcW w:type="dxa" w:w="1100"/>
+          </w:tcPr>
+          <w:p/>
+        </w:tc>
+      </w:tr>
+      <w:tr>
+        <w:tc>
+          <w:tcPr>
+            <w:tcW w:type="dxa" w:w="1900"/>
+            <w:vMerge/>
+          </w:tcPr>
+          <w:p/>
+        </w:tc>
+        <w:tc>
+          <w:tcPr>
+            <w:tcW w:type="dxa" w:w="600"/>
+          </w:tcPr>
+          <w:p/>
+        </w:tc>
+        <w:tc>
+          <w:tcPr>
+            <w:tcW w:type="dxa" w:w="2300"/>
+          </w:tcPr>
+          <w:p/>
+        </w:tc>
+        <w:tc>
+          <w:tcPr>
+            <w:tcW w:type="dxa" w:w="4500"/>
+          </w:tcPr>
+          <w:p>
+            <w:pPr>
+              <w:spacing w:after="0"/>
+            </w:pPr>
+            <w:r/>
+            <w:r>
+              <w:rPr>
+                <w:rFonts w:ascii="Calibri" w:hAnsi="Calibri"/>
+                <w:sz w:val="21"/>
+              </w:rPr>
+              <w:t>Check if the picture is larger than 10 MB: click Add, open More details, click Upload and choose a picture larger than 10 MB. Only PNG, JPG, WEBP or GIF up to 10 MB is accepted</w:t>
+            </w:r>
+          </w:p>
+        </w:tc>
+        <w:tc>
+          <w:tcPr>
+            <w:tcW w:type="dxa" w:w="4700"/>
+          </w:tcPr>
+          <w:p>
+            <w:pPr>
+              <w:spacing w:after="0"/>
+            </w:pPr>
+            <w:r/>
+            <w:r>
+              <w:rPr>
+                <w:rFonts w:ascii="Calibri" w:hAnsi="Calibri"/>
+                <w:sz w:val="21"/>
+              </w:rPr>
+              <w:t>"This picture is (n) MB. Choose one of 10 MB or less." is displayed and the picture is not attached; the server also refuses a picture over 10 MB with HTTP 400</w:t>
             </w:r>
           </w:p>
         </w:tc>
@@ -3619,7 +3919,7 @@
                 <w:rFonts w:ascii="Calibri" w:hAnsi="Calibri"/>
                 <w:sz w:val="21"/>
               </w:rPr>
-              <w:t>Check if expired stock is written off: click Stock on an expired product, choose "Add stock (received, found, returned)", enter the quantity and the new expiration date, then click Save adjustment</w:t>
+              <w:t>Check if expired stock is written off: in Suppliers, open the Orders view, click Receive into stock on an order for a product that has expired, enter the new batch's expiration date (7 days ahead or later), then confirm. PUT /api/purchase-orders/(id)/status 'received' runs as one transaction</w:t>
             </w:r>
           </w:p>
         </w:tc>
@@ -3637,7 +3937,7 @@
                 <w:rFonts w:ascii="Calibri" w:hAnsi="Calibri"/>
                 <w:sz w:val="21"/>
               </w:rPr>
-              <w:t>A stock_movements row 'damage' takes off the expired units, the new quantity is added, products.expiration_date is set to the new date, and "Recorded +(qty). The (n) expired were removed. Stock is now (qty)." is displayed</w:t>
+              <w:t>A stock_movements row 'damage' takes off the expired units, the received quantity is added with a 'purchase' row, products.expiration_date is set to the new date, and the order reads Received</w:t>
             </w:r>
           </w:p>
         </w:tc>
@@ -4071,6 +4371,81 @@
         <w:tc>
           <w:tcPr>
             <w:tcW w:type="dxa" w:w="600"/>
+          </w:tcPr>
+          <w:p/>
+        </w:tc>
+        <w:tc>
+          <w:tcPr>
+            <w:tcW w:type="dxa" w:w="2300"/>
+          </w:tcPr>
+          <w:p/>
+        </w:tc>
+        <w:tc>
+          <w:tcPr>
+            <w:tcW w:type="dxa" w:w="4500"/>
+          </w:tcPr>
+          <w:p>
+            <w:pPr>
+              <w:spacing w:after="0"/>
+            </w:pPr>
+            <w:r/>
+            <w:r>
+              <w:rPr>
+                <w:rFonts w:ascii="Calibri" w:hAnsi="Calibri"/>
+                <w:sz w:val="21"/>
+              </w:rPr>
+              <w:t>Check if the end-of-day date is in the future: click End of day and type a business date after today. The date picker stops at today</w:t>
+            </w:r>
+          </w:p>
+        </w:tc>
+        <w:tc>
+          <w:tcPr>
+            <w:tcW w:type="dxa" w:w="4700"/>
+          </w:tcPr>
+          <w:p>
+            <w:pPr>
+              <w:spacing w:after="0"/>
+            </w:pPr>
+            <w:r/>
+            <w:r>
+              <w:rPr>
+                <w:rFonts w:ascii="Calibri" w:hAnsi="Calibri"/>
+                <w:sz w:val="21"/>
+              </w:rPr>
+              <w:t>"You cannot count a day that has not happened yet. Choose today or an earlier date." is displayed and the date goes back to today; GET and POST /api/sales/eod refuse a future date with HTTP 400</w:t>
+            </w:r>
+          </w:p>
+        </w:tc>
+        <w:tc>
+          <w:tcPr>
+            <w:tcW w:type="dxa" w:w="2100"/>
+          </w:tcPr>
+          <w:p/>
+        </w:tc>
+        <w:tc>
+          <w:tcPr>
+            <w:tcW w:type="dxa" w:w="1520"/>
+          </w:tcPr>
+          <w:p/>
+        </w:tc>
+        <w:tc>
+          <w:tcPr>
+            <w:tcW w:type="dxa" w:w="1100"/>
+          </w:tcPr>
+          <w:p/>
+        </w:tc>
+      </w:tr>
+      <w:tr>
+        <w:tc>
+          <w:tcPr>
+            <w:tcW w:type="dxa" w:w="1900"/>
+            <w:vMerge/>
+          </w:tcPr>
+          <w:p/>
+        </w:tc>
+        <w:tc>
+          <w:tcPr>
+            <w:tcW w:type="dxa" w:w="600"/>
             <w:shd w:val="clear" w:color="auto" w:fill="D0CECE"/>
           </w:tcPr>
           <w:p>
@@ -5051,7 +5426,7 @@
                 <w:rFonts w:ascii="Calibri" w:hAnsi="Calibri"/>
                 <w:sz w:val="21"/>
               </w:rPr>
-              <w:t>Check if the expiration date is before today: in the Orders view, click Receive into stock and enter an expiration date earlier than today</w:t>
+              <w:t>Check if the expiration date is less than 7 days away: in the Orders view, click Receive into stock and enter an expiration date less than 7 days from today</w:t>
             </w:r>
           </w:p>
         </w:tc>
@@ -5069,7 +5444,7 @@
                 <w:rFonts w:ascii="Calibri" w:hAnsi="Calibri"/>
                 <w:sz w:val="21"/>
               </w:rPr>
-              <w:t>"The expiration date cannot be earlier than today." is displayed; the order is not marked received and stock_quantity does not change</w:t>
+              <w:t>"The expiration date must be at least 7 days from today: (date) or later." is displayed; the order is not marked received and stock_quantity does not change</w:t>
             </w:r>
           </w:p>
         </w:tc>

</xml_diff>